<commit_message>
ISO W10 sapuan SOP Commercial: COM-SOP-01, 02 (cakupan label 4.10 dan 4.7 disamakan dengan bed1bb6)
Co-Authored-By: Claude Opus 5.5 <noreply@anthropic.com>
Claude-Session: https://claude.ai/code/session_01BhkCQM7h3krZb9kjY2Nate
</commit_message>
<xml_diff>
--- a/out/05_Commercial/SNX-COM-SOP-02 Proposal, Quotation & Pricing Control (Rev00 DRAFT).docx
+++ b/out/05_Commercial/SNX-COM-SOP-02 Proposal, Quotation & Pricing Control (Rev00 DRAFT).docx
@@ -217,6 +217,7 @@
     <w:p>
       <w:pPr>
         <w:pStyle w:val="Heading1"/>
+        <w:keepNext/>
         <w:widowControl w:val="0"/>
         <w:spacing w:line="240" w:lineRule="auto"/>
         <w:ind w:right="407" w:firstLine="0"/>
@@ -511,6 +512,10 @@
         <w:gridCol w:w="5850"/>
       </w:tblGrid>
       <w:tr>
+        <w:trPr>
+          <w:cantSplit/>
+          <w:tblHeader/>
+        </w:trPr>
         <w:tc>
           <w:tcPr>
             <w:tcW w:w="3150" w:type="dxa"/>
@@ -523,6 +528,7 @@
           </w:tcPr>
           <w:p>
             <w:pPr>
+              <w:keepNext/>
               <w:widowControl w:val="0"/>
               <w:pBdr>
                 <w:top w:val="nil"/>
@@ -563,6 +569,7 @@
           </w:tcPr>
           <w:p>
             <w:pPr>
+              <w:keepNext/>
               <w:widowControl w:val="0"/>
               <w:pBdr>
                 <w:top w:val="nil"/>
@@ -593,6 +600,9 @@
         </w:tc>
       </w:tr>
       <w:tr>
+        <w:trPr>
+          <w:cantSplit/>
+        </w:trPr>
         <w:tc>
           <w:tcPr>
             <w:tcW w:w="3150" w:type="dxa"/>
@@ -646,6 +656,9 @@
         </w:tc>
       </w:tr>
       <w:tr>
+        <w:trPr>
+          <w:cantSplit/>
+        </w:trPr>
         <w:tc>
           <w:tcPr>
             <w:tcW w:w="3150" w:type="dxa"/>
@@ -699,6 +712,9 @@
         </w:tc>
       </w:tr>
       <w:tr>
+        <w:trPr>
+          <w:cantSplit/>
+        </w:trPr>
         <w:tc>
           <w:tcPr>
             <w:tcW w:w="3150" w:type="dxa"/>
@@ -750,6 +766,9 @@
         </w:tc>
       </w:tr>
       <w:tr>
+        <w:trPr>
+          <w:cantSplit/>
+        </w:trPr>
         <w:tc>
           <w:tcPr>
             <w:tcW w:w="3150" w:type="dxa"/>
@@ -810,6 +829,9 @@
         </w:tc>
       </w:tr>
       <w:tr>
+        <w:trPr>
+          <w:cantSplit/>
+        </w:trPr>
         <w:tc>
           <w:tcPr>
             <w:tcW w:w="3150" w:type="dxa"/>
@@ -861,6 +883,9 @@
         </w:tc>
       </w:tr>
       <w:tr>
+        <w:trPr>
+          <w:cantSplit/>
+        </w:trPr>
         <w:tc>
           <w:tcPr>
             <w:tcW w:w="3150" w:type="dxa"/>
@@ -914,6 +939,9 @@
         </w:tc>
       </w:tr>
       <w:tr>
+        <w:trPr>
+          <w:cantSplit/>
+        </w:trPr>
         <w:tc>
           <w:tcPr>
             <w:tcW w:w="3150" w:type="dxa"/>
@@ -967,6 +995,9 @@
         </w:tc>
       </w:tr>
       <w:tr>
+        <w:trPr>
+          <w:cantSplit/>
+        </w:trPr>
         <w:tc>
           <w:tcPr>
             <w:tcW w:w="3150" w:type="dxa"/>
@@ -1020,6 +1051,9 @@
         </w:tc>
       </w:tr>
       <w:tr>
+        <w:trPr>
+          <w:cantSplit/>
+        </w:trPr>
         <w:tc>
           <w:tcPr>
             <w:tcW w:w="3150" w:type="dxa"/>
@@ -1073,6 +1107,9 @@
         </w:tc>
       </w:tr>
       <w:tr>
+        <w:trPr>
+          <w:cantSplit/>
+        </w:trPr>
         <w:tc>
           <w:tcPr>
             <w:tcW w:w="3150" w:type="dxa"/>
@@ -1126,6 +1163,9 @@
         </w:tc>
       </w:tr>
       <w:tr>
+        <w:trPr>
+          <w:cantSplit/>
+        </w:trPr>
         <w:tc>
           <w:tcPr>
             <w:tcW w:w="3150" w:type="dxa"/>
@@ -1207,6 +1247,7 @@
     <w:p>
       <w:pPr>
         <w:pStyle w:val="Heading1"/>
+        <w:keepNext/>
         <w:widowControl w:val="0"/>
         <w:spacing w:before="816" w:line="240" w:lineRule="auto"/>
         <w:ind w:right="407"/>
@@ -1243,6 +1284,10 @@
         <w:gridCol w:w="3010"/>
       </w:tblGrid>
       <w:tr>
+        <w:trPr>
+          <w:cantSplit/>
+          <w:tblHeader/>
+        </w:trPr>
         <w:tc>
           <w:tcPr>
             <w:tcW w:w="3009" w:type="dxa"/>
@@ -1255,6 +1300,7 @@
           </w:tcPr>
           <w:p>
             <w:pPr>
+              <w:keepNext/>
               <w:widowControl w:val="0"/>
               <w:spacing w:line="240" w:lineRule="auto"/>
               <w:jc w:val="center"/>
@@ -1288,6 +1334,7 @@
           </w:tcPr>
           <w:p>
             <w:pPr>
+              <w:keepNext/>
               <w:widowControl w:val="0"/>
               <w:spacing w:line="240" w:lineRule="auto"/>
               <w:jc w:val="center"/>
@@ -1321,6 +1368,7 @@
           </w:tcPr>
           <w:p>
             <w:pPr>
+              <w:keepNext/>
               <w:widowControl w:val="0"/>
               <w:spacing w:line="240" w:lineRule="auto"/>
               <w:jc w:val="center"/>
@@ -1344,6 +1392,9 @@
         </w:tc>
       </w:tr>
       <w:tr>
+        <w:trPr>
+          <w:cantSplit/>
+        </w:trPr>
         <w:tc>
           <w:tcPr>
             <w:tcW w:w="3009" w:type="dxa"/>
@@ -1392,6 +1443,9 @@
         </w:tc>
       </w:tr>
       <w:tr>
+        <w:trPr>
+          <w:cantSplit/>
+        </w:trPr>
         <w:tc>
           <w:tcPr>
             <w:tcW w:w="3009" w:type="dxa"/>
@@ -1463,6 +1517,9 @@
         </w:tc>
       </w:tr>
       <w:tr>
+        <w:trPr>
+          <w:cantSplit/>
+        </w:trPr>
         <w:tc>
           <w:tcPr>
             <w:tcW w:w="3009" w:type="dxa"/>
@@ -1537,6 +1594,7 @@
     <w:p>
       <w:pPr>
         <w:pStyle w:val="Heading1"/>
+        <w:keepNext/>
         <w:widowControl w:val="0"/>
         <w:spacing w:before="816" w:line="240" w:lineRule="auto"/>
         <w:ind w:right="407"/>
@@ -1578,6 +1636,10 @@
         <w:gridCol w:w="2235"/>
       </w:tblGrid>
       <w:tr>
+        <w:trPr>
+          <w:cantSplit/>
+          <w:tblHeader/>
+        </w:trPr>
         <w:tc>
           <w:tcPr>
             <w:tcW w:w="810" w:type="dxa"/>
@@ -1590,6 +1652,7 @@
           </w:tcPr>
           <w:p>
             <w:pPr>
+              <w:keepNext/>
               <w:widowControl w:val="0"/>
               <w:pBdr>
                 <w:top w:val="nil"/>
@@ -1630,6 +1693,7 @@
           </w:tcPr>
           <w:p>
             <w:pPr>
+              <w:keepNext/>
               <w:widowControl w:val="0"/>
               <w:spacing w:line="240" w:lineRule="auto"/>
               <w:jc w:val="center"/>
@@ -1663,6 +1727,7 @@
           </w:tcPr>
           <w:p>
             <w:pPr>
+              <w:keepNext/>
               <w:widowControl w:val="0"/>
               <w:pBdr>
                 <w:top w:val="nil"/>
@@ -1703,6 +1768,7 @@
           </w:tcPr>
           <w:p>
             <w:pPr>
+              <w:keepNext/>
               <w:widowControl w:val="0"/>
               <w:pBdr>
                 <w:top w:val="nil"/>
@@ -1733,6 +1799,9 @@
         </w:tc>
       </w:tr>
       <w:tr>
+        <w:trPr>
+          <w:cantSplit/>
+        </w:trPr>
         <w:tc>
           <w:tcPr>
             <w:tcW w:w="810" w:type="dxa"/>
@@ -1835,6 +1904,9 @@
         </w:tc>
       </w:tr>
       <w:tr>
+        <w:trPr>
+          <w:cantSplit/>
+        </w:trPr>
         <w:tc>
           <w:tcPr>
             <w:tcW w:w="810" w:type="dxa"/>
@@ -1937,6 +2009,9 @@
         </w:tc>
       </w:tr>
       <w:tr>
+        <w:trPr>
+          <w:cantSplit/>
+        </w:trPr>
         <w:tc>
           <w:tcPr>
             <w:tcW w:w="810" w:type="dxa"/>
@@ -2420,7 +2495,7 @@
           <w:sz w:val="24"/>
           <w:szCs w:val="24"/>
         </w:rPr>
-        <w:t xml:space="preserve">Hasil yang dijaga: penawaran memuat scope dan timeline yang sudah dikonfirmasi, harga dan margin yang sudah diverifikasi, dan hanya pengecualian komersial yang sudah disetujui, lalu dikirim sesudah review internal serta persetujuan harga dan diskon (jika ada) selesai.</w:t>
+        <w:t xml:space="preserve">Hasil yang dijaga: penawaran memuat scope dan timeline yang sudah dikonfirmasi, harga dan margin yang sudah diverifikasi, dan hanya pengecualian komersial yang sudah disetujui, lalu dikirim setelah review internal serta persetujuan harga dan diskon (jika ada) selesai.</w:t>
       </w:r>
     </w:p>
     <w:p>
@@ -2483,7 +2558,7 @@
           <w:sz w:val="24"/>
           <w:szCs w:val="24"/>
         </w:rPr>
-        <w:t xml:space="preserve">Proses yang tercakup: penyusunan proposal dan quotation sesudah discovery meeting selesai, review scope, validasi harga dan margin, pengecualian komersial, review internal, persetujuan harga dan diskon, dan pengiriman penawaran ke customer. Proses berakhir saat Business Development mengirim penawaran dan mencatatnya di CRM.</w:t>
+        <w:t xml:space="preserve">Proses yang tercakup: penyusunan proposal dan quotation setelah discovery meeting selesai, review scope, validasi harga dan margin, pengecualian komersial, review internal, persetujuan harga dan diskon, dan pengiriman penawaran ke customer. Proses berakhir saat Business Development mengirim penawaran dan mencatatnya di CRM.</w:t>
       </w:r>
     </w:p>
     <w:p>
@@ -2507,7 +2582,7 @@
           <w:sz w:val="24"/>
           <w:szCs w:val="24"/>
         </w:rPr>
-        <w:t xml:space="preserve">Sistem yang dipakai: CRM. Lokasi berkas proposal, quotation, lembar harga dan margin, dan rekaman persetujuan belum ditetapkan.</w:t>
+        <w:t xml:space="preserve">Sistem yang dipakai: CRM. Lokasi berkas proposal, quotation, lembar harga dan margin, dan record persetujuan belum ditetapkan.</w:t>
       </w:r>
     </w:p>
     <w:p>
@@ -2537,6 +2612,7 @@
     <w:p>
       <w:pPr>
         <w:pStyle w:val="Heading1"/>
+        <w:keepNext/>
         <w:numPr>
           <w:ilvl w:val="0"/>
           <w:numId w:val="7"/>
@@ -2571,6 +2647,8 @@
       </w:tblGrid>
       <w:tr>
         <w:trPr>
+          <w:cantSplit/>
+          <w:tblHeader/>
           <w:jc w:val="center"/>
         </w:trPr>
         <w:tc>
@@ -2580,6 +2658,7 @@
           </w:tcPr>
           <w:p>
             <w:pPr>
+              <w:keepNext/>
               <w:jc w:val="center"/>
               <w:rPr>
                 <w:sz w:val="24"/>
@@ -2604,6 +2683,7 @@
           </w:tcPr>
           <w:p>
             <w:pPr>
+              <w:keepNext/>
               <w:jc w:val="center"/>
               <w:rPr>
                 <w:sz w:val="24"/>
@@ -2624,6 +2704,7 @@
       </w:tr>
       <w:tr>
         <w:trPr>
+          <w:cantSplit/>
           <w:jc w:val="center"/>
         </w:trPr>
         <w:tc>
@@ -2673,6 +2754,7 @@
       </w:tr>
       <w:tr>
         <w:trPr>
+          <w:cantSplit/>
           <w:jc w:val="center"/>
         </w:trPr>
         <w:tc>
@@ -2722,6 +2804,7 @@
       </w:tr>
       <w:tr>
         <w:trPr>
+          <w:cantSplit/>
           <w:jc w:val="center"/>
         </w:trPr>
         <w:tc>
@@ -2771,6 +2854,7 @@
       </w:tr>
       <w:tr>
         <w:trPr>
+          <w:cantSplit/>
           <w:jc w:val="center"/>
         </w:trPr>
         <w:tc>
@@ -2820,6 +2904,7 @@
       </w:tr>
       <w:tr>
         <w:trPr>
+          <w:cantSplit/>
           <w:jc w:val="center"/>
         </w:trPr>
         <w:tc>
@@ -2862,13 +2947,14 @@
                 <w:sz w:val="24"/>
                 <w:szCs w:val="24"/>
               </w:rPr>
-              <w:t>Kebutuhan bisnis customer yang Business Development catat di CRM sebagai salah satu keluaran discovery meeting.</w:t>
+              <w:t>Kebutuhan bisnis customer yang dicatat Business Development di CRM sebagai salah satu keluaran discovery meeting.</w:t>
             </w:r>
           </w:p>
         </w:tc>
       </w:tr>
       <w:tr>
         <w:trPr>
+          <w:cantSplit/>
           <w:jc w:val="center"/>
         </w:trPr>
         <w:tc>
@@ -2911,13 +2997,14 @@
                 <w:sz w:val="24"/>
                 <w:szCs w:val="24"/>
               </w:rPr>
-              <w:t>Rekaman hasil review internal, rekomendasi, persetujuan, margin final, dan keputusan pengecualian komersial untuk satu penawaran.</w:t>
+              <w:t>Record hasil review internal, rekomendasi, persetujuan, margin final, dan keputusan pengecualian komersial untuk satu penawaran.</w:t>
             </w:r>
           </w:p>
         </w:tc>
       </w:tr>
       <w:tr>
         <w:trPr>
+          <w:cantSplit/>
           <w:jc w:val="center"/>
         </w:trPr>
         <w:tc>
@@ -2960,13 +3047,14 @@
                 <w:sz w:val="24"/>
                 <w:szCs w:val="24"/>
               </w:rPr>
-              <w:t>Rekaman hasil review scope untuk satu proposal: kelayakan teknis, konfirmasi timeline dan scope, dan kesesuaian dengan Business Requirement.</w:t>
+              <w:t>Record hasil review scope untuk satu proposal: kelayakan teknis, konfirmasi timeline dan scope, dan kesesuaian dengan Business Requirement.</w:t>
             </w:r>
           </w:p>
         </w:tc>
       </w:tr>
       <w:tr>
         <w:trPr>
+          <w:cantSplit/>
           <w:jc w:val="center"/>
         </w:trPr>
         <w:tc>
@@ -3009,13 +3097,14 @@
                 <w:sz w:val="24"/>
                 <w:szCs w:val="24"/>
               </w:rPr>
-              <w:t>Cost of goods sold: biaya langsung yang SINUX tanggung untuk menyediakan solusi yang dijual.</w:t>
+              <w:t>Cost of goods sold: biaya langsung yang ditanggung SINUX untuk menyediakan solusi yang dijual.</w:t>
             </w:r>
           </w:p>
         </w:tc>
       </w:tr>
       <w:tr>
         <w:trPr>
+          <w:cantSplit/>
           <w:jc w:val="center"/>
         </w:trPr>
         <w:tc>
@@ -3065,6 +3154,7 @@
       </w:tr>
       <w:tr>
         <w:trPr>
+          <w:cantSplit/>
           <w:jc w:val="center"/>
         </w:trPr>
         <w:tc>
@@ -3114,6 +3204,7 @@
       </w:tr>
       <w:tr>
         <w:trPr>
+          <w:cantSplit/>
           <w:jc w:val="center"/>
         </w:trPr>
         <w:tc>
@@ -3163,6 +3254,7 @@
       </w:tr>
       <w:tr>
         <w:trPr>
+          <w:cantSplit/>
           <w:jc w:val="center"/>
         </w:trPr>
         <w:tc>
@@ -3205,13 +3297,14 @@
                 <w:sz w:val="24"/>
                 <w:szCs w:val="24"/>
               </w:rPr>
-              <w:t>Jabatan Direktur (JA-02) di SNX-HR-ORG-01. Dokumen Operation menyebutnya COO; sesudah penyebutan ini SOP ini memakai COO.</w:t>
+              <w:t>Jabatan Direktur (JA-02) di SNX-HR-ORG-01. Dokumen Operation menyebutnya COO; setelah penyebutan ini SOP ini memakai COO.</w:t>
             </w:r>
           </w:p>
         </w:tc>
       </w:tr>
       <w:tr>
         <w:trPr>
+          <w:cantSplit/>
           <w:jc w:val="center"/>
         </w:trPr>
         <w:tc>
@@ -3254,13 +3347,14 @@
                 <w:sz w:val="24"/>
                 <w:szCs w:val="24"/>
               </w:rPr>
-              <w:t>Pertemuan Business Development dengan customer untuk menggali kebutuhan bisnis, diatur di SNX-COM-SOP-01 butir 6.3.</w:t>
+              <w:t>Pertemuan Business Development dengan customer untuk menggali kebutuhan bisnis (SNX-COM-SOP-01 butir 6.3).</w:t>
             </w:r>
           </w:p>
         </w:tc>
       </w:tr>
       <w:tr>
         <w:trPr>
+          <w:cantSplit/>
           <w:jc w:val="center"/>
         </w:trPr>
         <w:tc>
@@ -3310,6 +3404,7 @@
       </w:tr>
       <w:tr>
         <w:trPr>
+          <w:cantSplit/>
           <w:jc w:val="center"/>
         </w:trPr>
         <w:tc>
@@ -3352,13 +3447,14 @@
                 <w:sz w:val="24"/>
                 <w:szCs w:val="24"/>
               </w:rPr>
-              <w:t>Rekaman perhitungan harga satu penawaran: komponen harga, COGS, diskon (jika ada), dan margin.</w:t>
+              <w:t>Record perhitungan harga satu penawaran: komponen harga, COGS, diskon (jika ada), dan margin.</w:t>
             </w:r>
           </w:p>
         </w:tc>
       </w:tr>
       <w:tr>
         <w:trPr>
+          <w:cantSplit/>
           <w:jc w:val="center"/>
         </w:trPr>
         <w:tc>
@@ -3408,6 +3504,7 @@
       </w:tr>
       <w:tr>
         <w:trPr>
+          <w:cantSplit/>
           <w:jc w:val="center"/>
         </w:trPr>
         <w:tc>
@@ -3450,13 +3547,14 @@
                 <w:sz w:val="24"/>
                 <w:szCs w:val="24"/>
               </w:rPr>
-              <w:t>Margin yang COO tetapkan untuk satu penawaran sebelum penawaran dikirim.</w:t>
+              <w:t>Margin yang ditetapkan COO untuk satu penawaran sebelum penawaran dikirim.</w:t>
             </w:r>
           </w:p>
         </w:tc>
       </w:tr>
       <w:tr>
         <w:trPr>
+          <w:cantSplit/>
           <w:jc w:val="center"/>
         </w:trPr>
         <w:tc>
@@ -3506,6 +3604,7 @@
       </w:tr>
       <w:tr>
         <w:trPr>
+          <w:cantSplit/>
           <w:jc w:val="center"/>
         </w:trPr>
         <w:tc>
@@ -3548,13 +3647,14 @@
                 <w:sz w:val="24"/>
                 <w:szCs w:val="24"/>
               </w:rPr>
-              <w:t>Permintaan customer atau isi penawaran yang menyimpang dari yang sudah disetujui atau dari standar: perubahan harga, diskon, scope, atau timeline sesudah persetujuan diberikan; TOP di atas standar; klausul yang menyimpang dari template kontrak; atau komitmen di luar kontrak.</w:t>
+              <w:t>Permintaan customer atau isi penawaran yang menyimpang dari yang sudah disetujui atau dari standar: perubahan harga, diskon, scope, atau timeline setelah persetujuan diberikan; TOP di atas standar; klausul yang menyimpang dari template kontrak; atau komitmen di luar kontrak.</w:t>
             </w:r>
           </w:p>
         </w:tc>
       </w:tr>
       <w:tr>
         <w:trPr>
+          <w:cantSplit/>
           <w:jc w:val="center"/>
         </w:trPr>
         <w:tc>
@@ -3604,6 +3704,7 @@
       </w:tr>
       <w:tr>
         <w:trPr>
+          <w:cantSplit/>
           <w:jc w:val="center"/>
         </w:trPr>
         <w:tc>
@@ -3646,13 +3747,14 @@
                 <w:sz w:val="24"/>
                 <w:szCs w:val="24"/>
               </w:rPr>
-              <w:t>Dokumen yang menjelaskan solusi SINUX untuk satu opportunity, dengan isi minimal di butir 4.2.</w:t>
+              <w:t>Dokumen yang menjelaskan solusi SINUX untuk satu opportunity, minimal memuat Scope of Work, Proposed Solution, Deliverables, Timeline, Commercial Proposal, Assumptions, dan Exclusions.</w:t>
             </w:r>
           </w:p>
         </w:tc>
       </w:tr>
       <w:tr>
         <w:trPr>
+          <w:cantSplit/>
           <w:jc w:val="center"/>
         </w:trPr>
         <w:tc>
@@ -3702,6 +3804,7 @@
       </w:tr>
       <w:tr>
         <w:trPr>
+          <w:cantSplit/>
           <w:jc w:val="center"/>
         </w:trPr>
         <w:tc>
@@ -3751,6 +3854,7 @@
       </w:tr>
       <w:tr>
         <w:trPr>
+          <w:cantSplit/>
           <w:jc w:val="center"/>
         </w:trPr>
         <w:tc>
@@ -3800,6 +3904,7 @@
       </w:tr>
       <w:tr>
         <w:trPr>
+          <w:cantSplit/>
           <w:jc w:val="center"/>
         </w:trPr>
         <w:tc>
@@ -3842,13 +3947,14 @@
                 <w:sz w:val="24"/>
                 <w:szCs w:val="24"/>
               </w:rPr>
-              <w:t>Pemeriksaan atas proposal, quotation, Catatan review scope, dan lembar harga dan margin sebelum harga dan diskon diajukan untuk persetujuan; pelakunya di butir 4.8.</w:t>
+              <w:t>Pemeriksaan VP Commercial atas proposal, quotation, Catatan review scope, dan lembar harga dan margin sebelum harga dan diskon diajukan untuk persetujuan; penunjukan VP Commercial sebagai pelaku berstatus (USULAN).</w:t>
             </w:r>
           </w:p>
         </w:tc>
       </w:tr>
       <w:tr>
         <w:trPr>
+          <w:cantSplit/>
           <w:jc w:val="center"/>
         </w:trPr>
         <w:tc>
@@ -3898,6 +4004,7 @@
       </w:tr>
       <w:tr>
         <w:trPr>
+          <w:cantSplit/>
           <w:jc w:val="center"/>
         </w:trPr>
         <w:tc>
@@ -3998,7 +4105,7 @@
           <w:sz w:val="24"/>
           <w:szCs w:val="24"/>
         </w:rPr>
-        <w:t xml:space="preserve">4.1 Business Development menyusun proposal hanya sesudah qualification dan discovery meeting untuk opportunity itu selesai (SNX-COM-SOP-01 butir 4.6).</w:t>
+        <w:t xml:space="preserve">4.1 Business Development menyusun proposal hanya setelah qualification dan discovery meeting untuk opportunity itu selesai (SNX-COM-SOP-01 butir 4.6).</w:t>
       </w:r>
     </w:p>
     <w:p>
@@ -4070,7 +4177,7 @@
           <w:sz w:val="24"/>
           <w:szCs w:val="24"/>
         </w:rPr>
-        <w:t xml:space="preserve">4.4 Business Development hanya menawarkan fitur yang sudah tersedia, dan tidak menjanjikan timeline sebelum timeline itu dikonfirmasi menurut butir 4.5.</w:t>
+        <w:t xml:space="preserve">4.4 Business Development hanya menawarkan fitur yang sudah tersedia, dan tidak menjanjikan timeline sebelum timeline itu dikonfirmasi Service Delivery Manager (butir 4.5).</w:t>
       </w:r>
     </w:p>
     <w:p>
@@ -4118,7 +4225,7 @@
           <w:sz w:val="24"/>
           <w:szCs w:val="24"/>
         </w:rPr>
-        <w:t xml:space="preserve">4.6 Business Development memakai lembar harga dan margin yang sudah diverifikasi Accounting &amp; Tax sebelum review internal untuk setiap penawaran, dengan data margin dan COGS dari Finance (butir 6.3). Keterlibatan Finance dan Accounting &amp; Tax ini berstatus (USULAN).</w:t>
+        <w:t xml:space="preserve">4.6 Sebelum review internal, Business Development memakai lembar harga dan margin yang sudah diverifikasi Accounting &amp; Tax untuk setiap penawaran. Data margin dan COGS di lembar itu berasal dari Finance (butir 6.3). Keterlibatan Finance dan Accounting &amp; Tax ini berstatus (USULAN).</w:t>
       </w:r>
     </w:p>
     <w:p>
@@ -4142,7 +4249,7 @@
           <w:sz w:val="24"/>
           <w:szCs w:val="24"/>
         </w:rPr>
-        <w:t xml:space="preserve">4.7 Wewenang berikut berstatus (USULAN): VP Commercial merekomendasikan harga dan diskon, dan COO menyetujui harga dan diskon serta menetapkan margin final. Ambang diskon dan batas margin minimum belum ditetapkan; sampai ditetapkan, setiap penawaran memerlukan persetujuan COO atas harga dan margin final, dan setiap diskon memerlukan persetujuan COO. Hak otorisasi per jabatan mengikuti Authority Matrix.</w:t>
+        <w:t xml:space="preserve">4.7 VP Commercial merekomendasikan harga dan diskon, lalu COO menyetujui harga dan diskon serta menetapkan margin final (USULAN). Ambang diskon dan batas margin minimum belum ditetapkan. Sampai ditetapkan, setiap penawaran memerlukan persetujuan COO atas harga dan margin final, dan setiap diskon memerlukan persetujuan COO. Hak otorisasi per jabatan mengikuti Authority Matrix.</w:t>
       </w:r>
     </w:p>
     <w:p>
@@ -4166,7 +4273,7 @@
           <w:sz w:val="24"/>
           <w:szCs w:val="24"/>
         </w:rPr>
-        <w:t xml:space="preserve">4.8 Business Development mengirim penawaran hanya sesudah review internal, persetujuan harga, dan persetujuan diskon (jika ada) selesai, dalam urutan itu. VP Commercial menolak penawaran yang belum lengkap. VP Commercial melakukan review internal; penunjukan pelaku ini berstatus (USULAN).</w:t>
+        <w:t xml:space="preserve">4.8 Business Development mengirim penawaran hanya setelah review internal, persetujuan harga, dan persetujuan diskon (jika ada) selesai, dalam urutan itu. VP Commercial menolak penawaran yang belum lengkap. VP Commercial melakukan review internal; penunjukan pelaku ini berstatus (USULAN).</w:t>
       </w:r>
     </w:p>
     <w:p>
@@ -4214,7 +4321,7 @@
           <w:sz w:val="24"/>
           <w:szCs w:val="24"/>
         </w:rPr>
-        <w:t xml:space="preserve">4.10 Pihak yang memutuskan pengecualian komersial berstatus (USULAN): COO memutuskan diskon di luar yang sudah disetujui, harga baru, klausul yang menyimpang dari template kontrak, dan komitmen di luar kontrak, dengan rekomendasi VP Commercial dan, untuk klausul dan komitmen kontrak, rekomendasi Legal &amp; Compliance. Direktur Utama memutuskan TOP di atas standar secara tertulis (SNX-FAT-SOP-01 butir 4.8), sebelum penawaran yang memuatnya dikirim. Perubahan scope atau timeline diproses ulang lewat butir 6.2, dan lewat butir 6.3 dan 6.5 bila harga ikut berubah.</w:t>
+        <w:t xml:space="preserve">4.10 COO memutuskan diskon di luar yang sudah disetujui, harga baru, klausul yang menyimpang dari template kontrak, dan komitmen di luar kontrak. Keputusan itu diambil dengan rekomendasi VP Commercial, ditambah rekomendasi Legal &amp; Compliance untuk klausul dan komitmen kontrak. Direktur Utama memutuskan TOP di atas standar secara tertulis (SNX-FAT-SOP-01 butir 4.8) sebelum penawaran yang memuatnya dikirim. Perubahan scope atau timeline diproses ulang melalui butir 6.2, dan juga melalui butir 6.3 dan 6.5 jika harga ikut berubah. Penetapan pihak yang memutuskan pengecualian komersial ini berstatus (USULAN).</w:t>
       </w:r>
     </w:p>
     <w:p>
@@ -4310,12 +4417,13 @@
           <w:sz w:val="24"/>
           <w:szCs w:val="24"/>
         </w:rPr>
-        <w:t xml:space="preserve">4.14 Business Development mencatat proposal dan quotation di CRM; batas waktu pembaruannya ada di bagian 8.</w:t>
+        <w:t xml:space="preserve">4.14 Business Development mencatat proposal dan quotation di CRM dengan batas waktu pembaruan sesuai bagian 8.</w:t>
       </w:r>
     </w:p>
     <w:p>
       <w:pPr>
         <w:pStyle w:val="Heading1"/>
+        <w:keepNext/>
         <w:numPr>
           <w:ilvl w:val="0"/>
           <w:numId w:val="7"/>
@@ -4343,6 +4451,8 @@
       </w:tblGrid>
       <w:tr>
         <w:trPr>
+          <w:cantSplit/>
+          <w:tblHeader/>
           <w:jc w:val="center"/>
         </w:trPr>
         <w:tc>
@@ -4359,6 +4469,7 @@
           </w:tcPr>
           <w:p>
             <w:pPr>
+              <w:keepNext/>
               <w:jc w:val="center"/>
               <w:rPr>
                 <w:sz w:val="24"/>
@@ -4390,6 +4501,7 @@
           </w:tcPr>
           <w:p>
             <w:pPr>
+              <w:keepNext/>
               <w:jc w:val="center"/>
               <w:rPr>
                 <w:sz w:val="24"/>
@@ -4421,6 +4533,7 @@
           </w:tcPr>
           <w:p>
             <w:pPr>
+              <w:keepNext/>
               <w:jc w:val="center"/>
               <w:rPr>
                 <w:sz w:val="24"/>
@@ -4441,6 +4554,7 @@
       </w:tr>
       <w:tr>
         <w:trPr>
+          <w:cantSplit/>
           <w:jc w:val="center"/>
         </w:trPr>
         <w:tc>
@@ -4486,7 +4600,7 @@
           </w:tcPr>
           <w:p>
             <w:pPr>
-              <w:jc w:val="both"/>
+              <w:jc w:val="left"/>
               <w:rPr>
                 <w:sz w:val="24"/>
                 <w:szCs w:val="24"/>
@@ -4516,7 +4630,7 @@
           </w:tcPr>
           <w:p>
             <w:pPr>
-              <w:jc w:val="both"/>
+              <w:jc w:val="left"/>
               <w:rPr>
                 <w:sz w:val="24"/>
                 <w:szCs w:val="24"/>
@@ -4535,6 +4649,7 @@
       </w:tr>
       <w:tr>
         <w:trPr>
+          <w:cantSplit/>
           <w:jc w:val="center"/>
         </w:trPr>
         <w:tc>
@@ -4580,7 +4695,7 @@
           </w:tcPr>
           <w:p>
             <w:pPr>
-              <w:jc w:val="both"/>
+              <w:jc w:val="left"/>
               <w:rPr>
                 <w:sz w:val="24"/>
                 <w:szCs w:val="24"/>
@@ -4610,7 +4725,7 @@
           </w:tcPr>
           <w:p>
             <w:pPr>
-              <w:jc w:val="both"/>
+              <w:jc w:val="left"/>
               <w:rPr>
                 <w:sz w:val="24"/>
                 <w:szCs w:val="24"/>
@@ -4629,6 +4744,7 @@
       </w:tr>
       <w:tr>
         <w:trPr>
+          <w:cantSplit/>
           <w:jc w:val="center"/>
         </w:trPr>
         <w:tc>
@@ -4674,19 +4790,19 @@
           </w:tcPr>
           <w:p>
             <w:pPr>
-              <w:jc w:val="both"/>
-              <w:rPr>
-                <w:sz w:val="24"/>
-                <w:szCs w:val="24"/>
-              </w:rPr>
-            </w:pPr>
-            <w:r>
-              <w:rPr>
-                <w:b w:val="0"/>
-                <w:sz w:val="24"/>
-                <w:szCs w:val="24"/>
-              </w:rPr>
-              <w:t>Menyetujui harga dan diskon yang VP Commercial rekomendasikan, menetapkan margin final, dan memutuskan pengecualian komersial selain TOP di atas standar serta perubahan scope dan timeline (butir 4.7 dan 4.10).</w:t>
+              <w:jc w:val="left"/>
+              <w:rPr>
+                <w:sz w:val="24"/>
+                <w:szCs w:val="24"/>
+              </w:rPr>
+            </w:pPr>
+            <w:r>
+              <w:rPr>
+                <w:b w:val="0"/>
+                <w:sz w:val="24"/>
+                <w:szCs w:val="24"/>
+              </w:rPr>
+              <w:t>Menyetujui harga dan diskon yang direkomendasikan VP Commercial, menetapkan margin final, dan memutuskan pengecualian komersial selain TOP di atas standar serta perubahan scope dan timeline (butir 4.7 dan 4.10).</w:t>
             </w:r>
           </w:p>
         </w:tc>
@@ -4704,7 +4820,7 @@
           </w:tcPr>
           <w:p>
             <w:pPr>
-              <w:jc w:val="both"/>
+              <w:jc w:val="left"/>
               <w:rPr>
                 <w:sz w:val="24"/>
                 <w:szCs w:val="24"/>
@@ -4723,6 +4839,7 @@
       </w:tr>
       <w:tr>
         <w:trPr>
+          <w:cantSplit/>
           <w:jc w:val="center"/>
         </w:trPr>
         <w:tc>
@@ -4768,7 +4885,7 @@
           </w:tcPr>
           <w:p>
             <w:pPr>
-              <w:jc w:val="both"/>
+              <w:jc w:val="left"/>
               <w:rPr>
                 <w:sz w:val="24"/>
                 <w:szCs w:val="24"/>
@@ -4798,7 +4915,7 @@
           </w:tcPr>
           <w:p>
             <w:pPr>
-              <w:jc w:val="both"/>
+              <w:jc w:val="left"/>
               <w:rPr>
                 <w:sz w:val="24"/>
                 <w:szCs w:val="24"/>
@@ -4817,6 +4934,7 @@
       </w:tr>
       <w:tr>
         <w:trPr>
+          <w:cantSplit/>
           <w:jc w:val="center"/>
         </w:trPr>
         <w:tc>
@@ -4862,19 +4980,19 @@
           </w:tcPr>
           <w:p>
             <w:pPr>
-              <w:jc w:val="both"/>
-              <w:rPr>
-                <w:sz w:val="24"/>
-                <w:szCs w:val="24"/>
-              </w:rPr>
-            </w:pPr>
-            <w:r>
-              <w:rPr>
-                <w:b w:val="0"/>
-                <w:sz w:val="24"/>
-                <w:szCs w:val="24"/>
-              </w:rPr>
-              <w:t>Menilai kelayakan teknis solusi, menyusun solution design, sizing, BOM/BOQ, dan asumsi teknis proposal, dan mereview risiko implementasi, lisensi, kompatibilitas, dan dependensi vendor (butir 6.2). Menjalankan fungsi Presales (USULAN).</w:t>
+              <w:jc w:val="left"/>
+              <w:rPr>
+                <w:sz w:val="24"/>
+                <w:szCs w:val="24"/>
+              </w:rPr>
+            </w:pPr>
+            <w:r>
+              <w:rPr>
+                <w:b w:val="0"/>
+                <w:sz w:val="24"/>
+                <w:szCs w:val="24"/>
+              </w:rPr>
+              <w:t>Menilai kelayakan teknis solusi; menyusun solution design, sizing, BOM/BOQ, dan asumsi teknis proposal; serta mereview risiko implementasi, lisensi, kompatibilitas, dan dependensi vendor (butir 6.2). Menjalankan fungsi Presales (USULAN).</w:t>
             </w:r>
           </w:p>
         </w:tc>
@@ -4892,7 +5010,7 @@
           </w:tcPr>
           <w:p>
             <w:pPr>
-              <w:jc w:val="both"/>
+              <w:jc w:val="left"/>
               <w:rPr>
                 <w:sz w:val="24"/>
                 <w:szCs w:val="24"/>
@@ -4911,6 +5029,7 @@
       </w:tr>
       <w:tr>
         <w:trPr>
+          <w:cantSplit/>
           <w:jc w:val="center"/>
         </w:trPr>
         <w:tc>
@@ -4956,19 +5075,19 @@
           </w:tcPr>
           <w:p>
             <w:pPr>
-              <w:jc w:val="both"/>
-              <w:rPr>
-                <w:sz w:val="24"/>
-                <w:szCs w:val="24"/>
-              </w:rPr>
-            </w:pPr>
-            <w:r>
-              <w:rPr>
-                <w:b w:val="0"/>
-                <w:sz w:val="24"/>
-                <w:szCs w:val="24"/>
-              </w:rPr>
-              <w:t>Mengonfirmasi timeline dan scope proposal (butir 6.2). Menjalankan fungsi Delivery dalam konfirmasi timeline dan scope (USULAN); jabatan usulan tanpa pemegang menurut SNX-HR-ORG-01.</w:t>
+              <w:jc w:val="left"/>
+              <w:rPr>
+                <w:sz w:val="24"/>
+                <w:szCs w:val="24"/>
+              </w:rPr>
+            </w:pPr>
+            <w:r>
+              <w:rPr>
+                <w:b w:val="0"/>
+                <w:sz w:val="24"/>
+                <w:szCs w:val="24"/>
+              </w:rPr>
+              <w:t>Mengonfirmasi timeline dan scope proposal (butir 6.2). Menjalankan fungsi Delivery dalam konfirmasi timeline dan scope (USULAN).</w:t>
             </w:r>
           </w:p>
         </w:tc>
@@ -4986,7 +5105,7 @@
           </w:tcPr>
           <w:p>
             <w:pPr>
-              <w:jc w:val="both"/>
+              <w:jc w:val="left"/>
               <w:rPr>
                 <w:sz w:val="24"/>
                 <w:szCs w:val="24"/>
@@ -5005,6 +5124,7 @@
       </w:tr>
       <w:tr>
         <w:trPr>
+          <w:cantSplit/>
           <w:jc w:val="center"/>
         </w:trPr>
         <w:tc>
@@ -5050,7 +5170,7 @@
           </w:tcPr>
           <w:p>
             <w:pPr>
-              <w:jc w:val="both"/>
+              <w:jc w:val="left"/>
               <w:rPr>
                 <w:sz w:val="24"/>
                 <w:szCs w:val="24"/>
@@ -5080,7 +5200,7 @@
           </w:tcPr>
           <w:p>
             <w:pPr>
-              <w:jc w:val="both"/>
+              <w:jc w:val="left"/>
               <w:rPr>
                 <w:sz w:val="24"/>
                 <w:szCs w:val="24"/>
@@ -5099,6 +5219,7 @@
       </w:tr>
       <w:tr>
         <w:trPr>
+          <w:cantSplit/>
           <w:jc w:val="center"/>
         </w:trPr>
         <w:tc>
@@ -5144,7 +5265,7 @@
           </w:tcPr>
           <w:p>
             <w:pPr>
-              <w:jc w:val="both"/>
+              <w:jc w:val="left"/>
               <w:rPr>
                 <w:sz w:val="24"/>
                 <w:szCs w:val="24"/>
@@ -5174,7 +5295,7 @@
           </w:tcPr>
           <w:p>
             <w:pPr>
-              <w:jc w:val="both"/>
+              <w:jc w:val="left"/>
               <w:rPr>
                 <w:sz w:val="24"/>
                 <w:szCs w:val="24"/>
@@ -5193,6 +5314,7 @@
       </w:tr>
       <w:tr>
         <w:trPr>
+          <w:cantSplit/>
           <w:jc w:val="center"/>
         </w:trPr>
         <w:tc>
@@ -5238,7 +5360,7 @@
           </w:tcPr>
           <w:p>
             <w:pPr>
-              <w:jc w:val="both"/>
+              <w:jc w:val="left"/>
               <w:rPr>
                 <w:sz w:val="24"/>
                 <w:szCs w:val="24"/>
@@ -5268,7 +5390,7 @@
           </w:tcPr>
           <w:p>
             <w:pPr>
-              <w:jc w:val="both"/>
+              <w:jc w:val="left"/>
               <w:rPr>
                 <w:sz w:val="24"/>
                 <w:szCs w:val="24"/>
@@ -5334,6 +5456,7 @@
     </w:p>
     <w:p>
       <w:pPr>
+        <w:keepNext/>
         <w:pBdr>
           <w:top w:val="nil"/>
           <w:left w:val="nil"/>
@@ -5353,7 +5476,7 @@
           <w:sz w:val="24"/>
           <w:szCs w:val="24"/>
         </w:rPr>
-        <w:t xml:space="preserve">Business Development menyusun proposal dari Business Requirement hasil discovery meeting, dan mengisi Commercial Proposal sesudah harga dan margin terverifikasi (butir 6.3).</w:t>
+        <w:t xml:space="preserve">Business Development menyusun proposal dari Business Requirement hasil discovery meeting, dan mengisi Commercial Proposal setelah harga dan margin terverifikasi (butir 6.3).</w:t>
       </w:r>
     </w:p>
     <w:tbl>
@@ -5366,27 +5489,30 @@
         <w:tblLook w:val="0400" w:firstRow="0" w:lastRow="0" w:firstColumn="0" w:lastColumn="0" w:noHBand="0" w:noVBand="1"/>
       </w:tblPr>
       <w:tblGrid>
-        <w:gridCol w:w="3367"/>
-        <w:gridCol w:w="2248"/>
-        <w:gridCol w:w="3913"/>
+        <w:gridCol w:w="4309"/>
+        <w:gridCol w:w="1927"/>
+        <w:gridCol w:w="2835"/>
       </w:tblGrid>
       <w:tr>
         <w:trPr>
+          <w:cantSplit/>
+          <w:tblHeader/>
           <w:jc w:val="center"/>
         </w:trPr>
         <w:tc>
           <w:tcPr>
-            <w:tcW w:w="3367" w:type="dxa"/>
-            <w:tcBorders>
-              <w:top w:val="single" w:sz="8" w:space="0" w:color="000000"/>
-              <w:left w:val="single" w:sz="8" w:space="0" w:color="000000"/>
-              <w:bottom w:val="single" w:sz="8" w:space="0" w:color="000000"/>
-              <w:right w:val="single" w:sz="8" w:space="0" w:color="000000"/>
-            </w:tcBorders>
-            <w:vAlign w:val="center"/>
-          </w:tcPr>
-          <w:p>
-            <w:pPr>
+            <w:tcW w:w="4309" w:type="dxa"/>
+            <w:tcBorders>
+              <w:top w:val="single" w:sz="8" w:space="0" w:color="000000"/>
+              <w:left w:val="single" w:sz="8" w:space="0" w:color="000000"/>
+              <w:bottom w:val="single" w:sz="8" w:space="0" w:color="000000"/>
+              <w:right w:val="single" w:sz="8" w:space="0" w:color="000000"/>
+            </w:tcBorders>
+            <w:vAlign w:val="center"/>
+          </w:tcPr>
+          <w:p>
+            <w:pPr>
+              <w:keepNext/>
               <w:jc w:val="center"/>
               <w:rPr>
                 <w:sz w:val="24"/>
@@ -5406,17 +5532,18 @@
         </w:tc>
         <w:tc>
           <w:tcPr>
-            <w:tcW w:w="2248" w:type="dxa"/>
-            <w:tcBorders>
-              <w:top w:val="single" w:sz="8" w:space="0" w:color="000000"/>
-              <w:left w:val="single" w:sz="8" w:space="0" w:color="000000"/>
-              <w:bottom w:val="single" w:sz="8" w:space="0" w:color="000000"/>
-              <w:right w:val="single" w:sz="8" w:space="0" w:color="000000"/>
-            </w:tcBorders>
-            <w:vAlign w:val="center"/>
-          </w:tcPr>
-          <w:p>
-            <w:pPr>
+            <w:tcW w:w="1927" w:type="dxa"/>
+            <w:tcBorders>
+              <w:top w:val="single" w:sz="8" w:space="0" w:color="000000"/>
+              <w:left w:val="single" w:sz="8" w:space="0" w:color="000000"/>
+              <w:bottom w:val="single" w:sz="8" w:space="0" w:color="000000"/>
+              <w:right w:val="single" w:sz="8" w:space="0" w:color="000000"/>
+            </w:tcBorders>
+            <w:vAlign w:val="center"/>
+          </w:tcPr>
+          <w:p>
+            <w:pPr>
+              <w:keepNext/>
               <w:jc w:val="center"/>
               <w:rPr>
                 <w:sz w:val="24"/>
@@ -5436,17 +5563,18 @@
         </w:tc>
         <w:tc>
           <w:tcPr>
-            <w:tcW w:w="3913" w:type="dxa"/>
-            <w:tcBorders>
-              <w:top w:val="single" w:sz="8" w:space="0" w:color="000000"/>
-              <w:left w:val="single" w:sz="8" w:space="0" w:color="000000"/>
-              <w:bottom w:val="single" w:sz="8" w:space="0" w:color="000000"/>
-              <w:right w:val="single" w:sz="8" w:space="0" w:color="000000"/>
-            </w:tcBorders>
-            <w:vAlign w:val="center"/>
-          </w:tcPr>
-          <w:p>
-            <w:pPr>
+            <w:tcW w:w="2835" w:type="dxa"/>
+            <w:tcBorders>
+              <w:top w:val="single" w:sz="8" w:space="0" w:color="000000"/>
+              <w:left w:val="single" w:sz="8" w:space="0" w:color="000000"/>
+              <w:bottom w:val="single" w:sz="8" w:space="0" w:color="000000"/>
+              <w:right w:val="single" w:sz="8" w:space="0" w:color="000000"/>
+            </w:tcBorders>
+            <w:vAlign w:val="center"/>
+          </w:tcPr>
+          <w:p>
+            <w:pPr>
+              <w:keepNext/>
               <w:jc w:val="center"/>
               <w:rPr>
                 <w:sz w:val="24"/>
@@ -5467,11 +5595,12 @@
       </w:tr>
       <w:tr>
         <w:trPr>
+          <w:cantSplit/>
           <w:jc w:val="center"/>
         </w:trPr>
         <w:tc>
           <w:tcPr>
-            <w:tcW w:w="3367" w:type="dxa"/>
+            <w:tcW w:w="4309" w:type="dxa"/>
             <w:tcBorders>
               <w:top w:val="single" w:sz="8" w:space="0" w:color="000000"/>
               <w:left w:val="single" w:sz="8" w:space="0" w:color="000000"/>
@@ -5499,7 +5628,7 @@
         </w:tc>
         <w:tc>
           <w:tcPr>
-            <w:tcW w:w="2248" w:type="dxa"/>
+            <w:tcW w:w="1927" w:type="dxa"/>
             <w:tcBorders>
               <w:top w:val="single" w:sz="8" w:space="0" w:color="000000"/>
               <w:left w:val="single" w:sz="8" w:space="0" w:color="000000"/>
@@ -5527,18 +5656,18 @@
         </w:tc>
         <w:tc>
           <w:tcPr>
-            <w:tcW w:w="3913" w:type="dxa"/>
-            <w:tcBorders>
-              <w:top w:val="single" w:sz="8" w:space="0" w:color="000000"/>
-              <w:left w:val="single" w:sz="8" w:space="0" w:color="000000"/>
-              <w:bottom w:val="single" w:sz="8" w:space="0" w:color="000000"/>
-              <w:right w:val="single" w:sz="8" w:space="0" w:color="000000"/>
-            </w:tcBorders>
-            <w:vAlign w:val="center"/>
-          </w:tcPr>
-          <w:p>
-            <w:pPr>
-              <w:jc w:val="both"/>
+            <w:tcW w:w="2835" w:type="dxa"/>
+            <w:tcBorders>
+              <w:top w:val="single" w:sz="8" w:space="0" w:color="000000"/>
+              <w:left w:val="single" w:sz="8" w:space="0" w:color="000000"/>
+              <w:bottom w:val="single" w:sz="8" w:space="0" w:color="000000"/>
+              <w:right w:val="single" w:sz="8" w:space="0" w:color="000000"/>
+            </w:tcBorders>
+            <w:vAlign w:val="center"/>
+          </w:tcPr>
+          <w:p>
+            <w:pPr>
+              <w:jc w:val="left"/>
               <w:rPr>
                 <w:sz w:val="24"/>
                 <w:szCs w:val="24"/>
@@ -5557,11 +5686,12 @@
       </w:tr>
       <w:tr>
         <w:trPr>
+          <w:cantSplit/>
           <w:jc w:val="center"/>
         </w:trPr>
         <w:tc>
           <w:tcPr>
-            <w:tcW w:w="3367" w:type="dxa"/>
+            <w:tcW w:w="4309" w:type="dxa"/>
             <w:tcBorders>
               <w:top w:val="single" w:sz="8" w:space="0" w:color="000000"/>
               <w:left w:val="single" w:sz="8" w:space="0" w:color="000000"/>
@@ -5589,7 +5719,7 @@
         </w:tc>
         <w:tc>
           <w:tcPr>
-            <w:tcW w:w="2248" w:type="dxa"/>
+            <w:tcW w:w="1927" w:type="dxa"/>
             <w:tcBorders>
               <w:top w:val="single" w:sz="8" w:space="0" w:color="000000"/>
               <w:left w:val="single" w:sz="8" w:space="0" w:color="000000"/>
@@ -5617,18 +5747,18 @@
         </w:tc>
         <w:tc>
           <w:tcPr>
-            <w:tcW w:w="3913" w:type="dxa"/>
-            <w:tcBorders>
-              <w:top w:val="single" w:sz="8" w:space="0" w:color="000000"/>
-              <w:left w:val="single" w:sz="8" w:space="0" w:color="000000"/>
-              <w:bottom w:val="single" w:sz="8" w:space="0" w:color="000000"/>
-              <w:right w:val="single" w:sz="8" w:space="0" w:color="000000"/>
-            </w:tcBorders>
-            <w:vAlign w:val="center"/>
-          </w:tcPr>
-          <w:p>
-            <w:pPr>
-              <w:jc w:val="both"/>
+            <w:tcW w:w="2835" w:type="dxa"/>
+            <w:tcBorders>
+              <w:top w:val="single" w:sz="8" w:space="0" w:color="000000"/>
+              <w:left w:val="single" w:sz="8" w:space="0" w:color="000000"/>
+              <w:bottom w:val="single" w:sz="8" w:space="0" w:color="000000"/>
+              <w:right w:val="single" w:sz="8" w:space="0" w:color="000000"/>
+            </w:tcBorders>
+            <w:vAlign w:val="center"/>
+          </w:tcPr>
+          <w:p>
+            <w:pPr>
+              <w:jc w:val="left"/>
               <w:rPr>
                 <w:sz w:val="24"/>
                 <w:szCs w:val="24"/>
@@ -5647,11 +5777,12 @@
       </w:tr>
       <w:tr>
         <w:trPr>
+          <w:cantSplit/>
           <w:jc w:val="center"/>
         </w:trPr>
         <w:tc>
           <w:tcPr>
-            <w:tcW w:w="3367" w:type="dxa"/>
+            <w:tcW w:w="4309" w:type="dxa"/>
             <w:tcBorders>
               <w:top w:val="single" w:sz="8" w:space="0" w:color="000000"/>
               <w:left w:val="single" w:sz="8" w:space="0" w:color="000000"/>
@@ -5679,7 +5810,7 @@
         </w:tc>
         <w:tc>
           <w:tcPr>
-            <w:tcW w:w="2248" w:type="dxa"/>
+            <w:tcW w:w="1927" w:type="dxa"/>
             <w:tcBorders>
               <w:top w:val="single" w:sz="8" w:space="0" w:color="000000"/>
               <w:left w:val="single" w:sz="8" w:space="0" w:color="000000"/>
@@ -5707,18 +5838,18 @@
         </w:tc>
         <w:tc>
           <w:tcPr>
-            <w:tcW w:w="3913" w:type="dxa"/>
-            <w:tcBorders>
-              <w:top w:val="single" w:sz="8" w:space="0" w:color="000000"/>
-              <w:left w:val="single" w:sz="8" w:space="0" w:color="000000"/>
-              <w:bottom w:val="single" w:sz="8" w:space="0" w:color="000000"/>
-              <w:right w:val="single" w:sz="8" w:space="0" w:color="000000"/>
-            </w:tcBorders>
-            <w:vAlign w:val="center"/>
-          </w:tcPr>
-          <w:p>
-            <w:pPr>
-              <w:jc w:val="both"/>
+            <w:tcW w:w="2835" w:type="dxa"/>
+            <w:tcBorders>
+              <w:top w:val="single" w:sz="8" w:space="0" w:color="000000"/>
+              <w:left w:val="single" w:sz="8" w:space="0" w:color="000000"/>
+              <w:bottom w:val="single" w:sz="8" w:space="0" w:color="000000"/>
+              <w:right w:val="single" w:sz="8" w:space="0" w:color="000000"/>
+            </w:tcBorders>
+            <w:vAlign w:val="center"/>
+          </w:tcPr>
+          <w:p>
+            <w:pPr>
+              <w:jc w:val="left"/>
               <w:rPr>
                 <w:sz w:val="24"/>
                 <w:szCs w:val="24"/>
@@ -5737,11 +5868,12 @@
       </w:tr>
       <w:tr>
         <w:trPr>
+          <w:cantSplit/>
           <w:jc w:val="center"/>
         </w:trPr>
         <w:tc>
           <w:tcPr>
-            <w:tcW w:w="3367" w:type="dxa"/>
+            <w:tcW w:w="4309" w:type="dxa"/>
             <w:tcBorders>
               <w:top w:val="single" w:sz="8" w:space="0" w:color="000000"/>
               <w:left w:val="single" w:sz="8" w:space="0" w:color="000000"/>
@@ -5769,7 +5901,7 @@
         </w:tc>
         <w:tc>
           <w:tcPr>
-            <w:tcW w:w="2248" w:type="dxa"/>
+            <w:tcW w:w="1927" w:type="dxa"/>
             <w:tcBorders>
               <w:top w:val="single" w:sz="8" w:space="0" w:color="000000"/>
               <w:left w:val="single" w:sz="8" w:space="0" w:color="000000"/>
@@ -5797,18 +5929,18 @@
         </w:tc>
         <w:tc>
           <w:tcPr>
-            <w:tcW w:w="3913" w:type="dxa"/>
-            <w:tcBorders>
-              <w:top w:val="single" w:sz="8" w:space="0" w:color="000000"/>
-              <w:left w:val="single" w:sz="8" w:space="0" w:color="000000"/>
-              <w:bottom w:val="single" w:sz="8" w:space="0" w:color="000000"/>
-              <w:right w:val="single" w:sz="8" w:space="0" w:color="000000"/>
-            </w:tcBorders>
-            <w:vAlign w:val="center"/>
-          </w:tcPr>
-          <w:p>
-            <w:pPr>
-              <w:jc w:val="both"/>
+            <w:tcW w:w="2835" w:type="dxa"/>
+            <w:tcBorders>
+              <w:top w:val="single" w:sz="8" w:space="0" w:color="000000"/>
+              <w:left w:val="single" w:sz="8" w:space="0" w:color="000000"/>
+              <w:bottom w:val="single" w:sz="8" w:space="0" w:color="000000"/>
+              <w:right w:val="single" w:sz="8" w:space="0" w:color="000000"/>
+            </w:tcBorders>
+            <w:vAlign w:val="center"/>
+          </w:tcPr>
+          <w:p>
+            <w:pPr>
+              <w:jc w:val="left"/>
               <w:rPr>
                 <w:sz w:val="24"/>
                 <w:szCs w:val="24"/>
@@ -5827,11 +5959,12 @@
       </w:tr>
       <w:tr>
         <w:trPr>
+          <w:cantSplit/>
           <w:jc w:val="center"/>
         </w:trPr>
         <w:tc>
           <w:tcPr>
-            <w:tcW w:w="3367" w:type="dxa"/>
+            <w:tcW w:w="4309" w:type="dxa"/>
             <w:tcBorders>
               <w:top w:val="single" w:sz="8" w:space="0" w:color="000000"/>
               <w:left w:val="single" w:sz="8" w:space="0" w:color="000000"/>
@@ -5859,7 +5992,7 @@
         </w:tc>
         <w:tc>
           <w:tcPr>
-            <w:tcW w:w="2248" w:type="dxa"/>
+            <w:tcW w:w="1927" w:type="dxa"/>
             <w:tcBorders>
               <w:top w:val="single" w:sz="8" w:space="0" w:color="000000"/>
               <w:left w:val="single" w:sz="8" w:space="0" w:color="000000"/>
@@ -5887,18 +6020,18 @@
         </w:tc>
         <w:tc>
           <w:tcPr>
-            <w:tcW w:w="3913" w:type="dxa"/>
-            <w:tcBorders>
-              <w:top w:val="single" w:sz="8" w:space="0" w:color="000000"/>
-              <w:left w:val="single" w:sz="8" w:space="0" w:color="000000"/>
-              <w:bottom w:val="single" w:sz="8" w:space="0" w:color="000000"/>
-              <w:right w:val="single" w:sz="8" w:space="0" w:color="000000"/>
-            </w:tcBorders>
-            <w:vAlign w:val="center"/>
-          </w:tcPr>
-          <w:p>
-            <w:pPr>
-              <w:jc w:val="both"/>
+            <w:tcW w:w="2835" w:type="dxa"/>
+            <w:tcBorders>
+              <w:top w:val="single" w:sz="8" w:space="0" w:color="000000"/>
+              <w:left w:val="single" w:sz="8" w:space="0" w:color="000000"/>
+              <w:bottom w:val="single" w:sz="8" w:space="0" w:color="000000"/>
+              <w:right w:val="single" w:sz="8" w:space="0" w:color="000000"/>
+            </w:tcBorders>
+            <w:vAlign w:val="center"/>
+          </w:tcPr>
+          <w:p>
+            <w:pPr>
+              <w:jc w:val="left"/>
               <w:rPr>
                 <w:sz w:val="24"/>
                 <w:szCs w:val="24"/>
@@ -5955,6 +6088,7 @@
     </w:p>
     <w:p>
       <w:pPr>
+        <w:keepNext/>
         <w:pBdr>
           <w:top w:val="nil"/>
           <w:left w:val="nil"/>
@@ -5974,7 +6108,7 @@
           <w:sz w:val="24"/>
           <w:szCs w:val="24"/>
         </w:rPr>
-        <w:t xml:space="preserve">Business Development meminta review scope sesudah draf proposal ada dan sebelum review internal (butir 4.5).</w:t>
+        <w:t xml:space="preserve">Business Development meminta review scope setelah draf proposal ada dan sebelum review internal (butir 4.5).</w:t>
       </w:r>
     </w:p>
     <w:tbl>
@@ -5987,27 +6121,30 @@
         <w:tblLook w:val="0400" w:firstRow="0" w:lastRow="0" w:firstColumn="0" w:lastColumn="0" w:noHBand="0" w:noVBand="1"/>
       </w:tblPr>
       <w:tblGrid>
-        <w:gridCol w:w="3367"/>
-        <w:gridCol w:w="2248"/>
-        <w:gridCol w:w="3913"/>
+        <w:gridCol w:w="4309"/>
+        <w:gridCol w:w="1927"/>
+        <w:gridCol w:w="2835"/>
       </w:tblGrid>
       <w:tr>
         <w:trPr>
+          <w:cantSplit/>
+          <w:tblHeader/>
           <w:jc w:val="center"/>
         </w:trPr>
         <w:tc>
           <w:tcPr>
-            <w:tcW w:w="3367" w:type="dxa"/>
-            <w:tcBorders>
-              <w:top w:val="single" w:sz="8" w:space="0" w:color="000000"/>
-              <w:left w:val="single" w:sz="8" w:space="0" w:color="000000"/>
-              <w:bottom w:val="single" w:sz="8" w:space="0" w:color="000000"/>
-              <w:right w:val="single" w:sz="8" w:space="0" w:color="000000"/>
-            </w:tcBorders>
-            <w:vAlign w:val="center"/>
-          </w:tcPr>
-          <w:p>
-            <w:pPr>
+            <w:tcW w:w="4309" w:type="dxa"/>
+            <w:tcBorders>
+              <w:top w:val="single" w:sz="8" w:space="0" w:color="000000"/>
+              <w:left w:val="single" w:sz="8" w:space="0" w:color="000000"/>
+              <w:bottom w:val="single" w:sz="8" w:space="0" w:color="000000"/>
+              <w:right w:val="single" w:sz="8" w:space="0" w:color="000000"/>
+            </w:tcBorders>
+            <w:vAlign w:val="center"/>
+          </w:tcPr>
+          <w:p>
+            <w:pPr>
+              <w:keepNext/>
               <w:jc w:val="center"/>
               <w:rPr>
                 <w:sz w:val="24"/>
@@ -6027,17 +6164,18 @@
         </w:tc>
         <w:tc>
           <w:tcPr>
-            <w:tcW w:w="2248" w:type="dxa"/>
-            <w:tcBorders>
-              <w:top w:val="single" w:sz="8" w:space="0" w:color="000000"/>
-              <w:left w:val="single" w:sz="8" w:space="0" w:color="000000"/>
-              <w:bottom w:val="single" w:sz="8" w:space="0" w:color="000000"/>
-              <w:right w:val="single" w:sz="8" w:space="0" w:color="000000"/>
-            </w:tcBorders>
-            <w:vAlign w:val="center"/>
-          </w:tcPr>
-          <w:p>
-            <w:pPr>
+            <w:tcW w:w="1927" w:type="dxa"/>
+            <w:tcBorders>
+              <w:top w:val="single" w:sz="8" w:space="0" w:color="000000"/>
+              <w:left w:val="single" w:sz="8" w:space="0" w:color="000000"/>
+              <w:bottom w:val="single" w:sz="8" w:space="0" w:color="000000"/>
+              <w:right w:val="single" w:sz="8" w:space="0" w:color="000000"/>
+            </w:tcBorders>
+            <w:vAlign w:val="center"/>
+          </w:tcPr>
+          <w:p>
+            <w:pPr>
+              <w:keepNext/>
               <w:jc w:val="center"/>
               <w:rPr>
                 <w:sz w:val="24"/>
@@ -6057,17 +6195,18 @@
         </w:tc>
         <w:tc>
           <w:tcPr>
-            <w:tcW w:w="3913" w:type="dxa"/>
-            <w:tcBorders>
-              <w:top w:val="single" w:sz="8" w:space="0" w:color="000000"/>
-              <w:left w:val="single" w:sz="8" w:space="0" w:color="000000"/>
-              <w:bottom w:val="single" w:sz="8" w:space="0" w:color="000000"/>
-              <w:right w:val="single" w:sz="8" w:space="0" w:color="000000"/>
-            </w:tcBorders>
-            <w:vAlign w:val="center"/>
-          </w:tcPr>
-          <w:p>
-            <w:pPr>
+            <w:tcW w:w="2835" w:type="dxa"/>
+            <w:tcBorders>
+              <w:top w:val="single" w:sz="8" w:space="0" w:color="000000"/>
+              <w:left w:val="single" w:sz="8" w:space="0" w:color="000000"/>
+              <w:bottom w:val="single" w:sz="8" w:space="0" w:color="000000"/>
+              <w:right w:val="single" w:sz="8" w:space="0" w:color="000000"/>
+            </w:tcBorders>
+            <w:vAlign w:val="center"/>
+          </w:tcPr>
+          <w:p>
+            <w:pPr>
+              <w:keepNext/>
               <w:jc w:val="center"/>
               <w:rPr>
                 <w:sz w:val="24"/>
@@ -6088,11 +6227,12 @@
       </w:tr>
       <w:tr>
         <w:trPr>
+          <w:cantSplit/>
           <w:jc w:val="center"/>
         </w:trPr>
         <w:tc>
           <w:tcPr>
-            <w:tcW w:w="3367" w:type="dxa"/>
+            <w:tcW w:w="4309" w:type="dxa"/>
             <w:tcBorders>
               <w:top w:val="single" w:sz="8" w:space="0" w:color="000000"/>
               <w:left w:val="single" w:sz="8" w:space="0" w:color="000000"/>
@@ -6120,7 +6260,7 @@
         </w:tc>
         <w:tc>
           <w:tcPr>
-            <w:tcW w:w="2248" w:type="dxa"/>
+            <w:tcW w:w="1927" w:type="dxa"/>
             <w:tcBorders>
               <w:top w:val="single" w:sz="8" w:space="0" w:color="000000"/>
               <w:left w:val="single" w:sz="8" w:space="0" w:color="000000"/>
@@ -6148,18 +6288,18 @@
         </w:tc>
         <w:tc>
           <w:tcPr>
-            <w:tcW w:w="3913" w:type="dxa"/>
-            <w:tcBorders>
-              <w:top w:val="single" w:sz="8" w:space="0" w:color="000000"/>
-              <w:left w:val="single" w:sz="8" w:space="0" w:color="000000"/>
-              <w:bottom w:val="single" w:sz="8" w:space="0" w:color="000000"/>
-              <w:right w:val="single" w:sz="8" w:space="0" w:color="000000"/>
-            </w:tcBorders>
-            <w:vAlign w:val="center"/>
-          </w:tcPr>
-          <w:p>
-            <w:pPr>
-              <w:jc w:val="both"/>
+            <w:tcW w:w="2835" w:type="dxa"/>
+            <w:tcBorders>
+              <w:top w:val="single" w:sz="8" w:space="0" w:color="000000"/>
+              <w:left w:val="single" w:sz="8" w:space="0" w:color="000000"/>
+              <w:bottom w:val="single" w:sz="8" w:space="0" w:color="000000"/>
+              <w:right w:val="single" w:sz="8" w:space="0" w:color="000000"/>
+            </w:tcBorders>
+            <w:vAlign w:val="center"/>
+          </w:tcPr>
+          <w:p>
+            <w:pPr>
+              <w:jc w:val="left"/>
               <w:rPr>
                 <w:sz w:val="24"/>
                 <w:szCs w:val="24"/>
@@ -6178,11 +6318,12 @@
       </w:tr>
       <w:tr>
         <w:trPr>
+          <w:cantSplit/>
           <w:jc w:val="center"/>
         </w:trPr>
         <w:tc>
           <w:tcPr>
-            <w:tcW w:w="3367" w:type="dxa"/>
+            <w:tcW w:w="4309" w:type="dxa"/>
             <w:tcBorders>
               <w:top w:val="single" w:sz="8" w:space="0" w:color="000000"/>
               <w:left w:val="single" w:sz="8" w:space="0" w:color="000000"/>
@@ -6210,7 +6351,7 @@
         </w:tc>
         <w:tc>
           <w:tcPr>
-            <w:tcW w:w="2248" w:type="dxa"/>
+            <w:tcW w:w="1927" w:type="dxa"/>
             <w:tcBorders>
               <w:top w:val="single" w:sz="8" w:space="0" w:color="000000"/>
               <w:left w:val="single" w:sz="8" w:space="0" w:color="000000"/>
@@ -6238,18 +6379,18 @@
         </w:tc>
         <w:tc>
           <w:tcPr>
-            <w:tcW w:w="3913" w:type="dxa"/>
-            <w:tcBorders>
-              <w:top w:val="single" w:sz="8" w:space="0" w:color="000000"/>
-              <w:left w:val="single" w:sz="8" w:space="0" w:color="000000"/>
-              <w:bottom w:val="single" w:sz="8" w:space="0" w:color="000000"/>
-              <w:right w:val="single" w:sz="8" w:space="0" w:color="000000"/>
-            </w:tcBorders>
-            <w:vAlign w:val="center"/>
-          </w:tcPr>
-          <w:p>
-            <w:pPr>
-              <w:jc w:val="both"/>
+            <w:tcW w:w="2835" w:type="dxa"/>
+            <w:tcBorders>
+              <w:top w:val="single" w:sz="8" w:space="0" w:color="000000"/>
+              <w:left w:val="single" w:sz="8" w:space="0" w:color="000000"/>
+              <w:bottom w:val="single" w:sz="8" w:space="0" w:color="000000"/>
+              <w:right w:val="single" w:sz="8" w:space="0" w:color="000000"/>
+            </w:tcBorders>
+            <w:vAlign w:val="center"/>
+          </w:tcPr>
+          <w:p>
+            <w:pPr>
+              <w:jc w:val="left"/>
               <w:rPr>
                 <w:sz w:val="24"/>
                 <w:szCs w:val="24"/>
@@ -6268,11 +6409,12 @@
       </w:tr>
       <w:tr>
         <w:trPr>
+          <w:cantSplit/>
           <w:jc w:val="center"/>
         </w:trPr>
         <w:tc>
           <w:tcPr>
-            <w:tcW w:w="3367" w:type="dxa"/>
+            <w:tcW w:w="4309" w:type="dxa"/>
             <w:tcBorders>
               <w:top w:val="single" w:sz="8" w:space="0" w:color="000000"/>
               <w:left w:val="single" w:sz="8" w:space="0" w:color="000000"/>
@@ -6300,7 +6442,7 @@
         </w:tc>
         <w:tc>
           <w:tcPr>
-            <w:tcW w:w="2248" w:type="dxa"/>
+            <w:tcW w:w="1927" w:type="dxa"/>
             <w:tcBorders>
               <w:top w:val="single" w:sz="8" w:space="0" w:color="000000"/>
               <w:left w:val="single" w:sz="8" w:space="0" w:color="000000"/>
@@ -6328,18 +6470,18 @@
         </w:tc>
         <w:tc>
           <w:tcPr>
-            <w:tcW w:w="3913" w:type="dxa"/>
-            <w:tcBorders>
-              <w:top w:val="single" w:sz="8" w:space="0" w:color="000000"/>
-              <w:left w:val="single" w:sz="8" w:space="0" w:color="000000"/>
-              <w:bottom w:val="single" w:sz="8" w:space="0" w:color="000000"/>
-              <w:right w:val="single" w:sz="8" w:space="0" w:color="000000"/>
-            </w:tcBorders>
-            <w:vAlign w:val="center"/>
-          </w:tcPr>
-          <w:p>
-            <w:pPr>
-              <w:jc w:val="both"/>
+            <w:tcW w:w="2835" w:type="dxa"/>
+            <w:tcBorders>
+              <w:top w:val="single" w:sz="8" w:space="0" w:color="000000"/>
+              <w:left w:val="single" w:sz="8" w:space="0" w:color="000000"/>
+              <w:bottom w:val="single" w:sz="8" w:space="0" w:color="000000"/>
+              <w:right w:val="single" w:sz="8" w:space="0" w:color="000000"/>
+            </w:tcBorders>
+            <w:vAlign w:val="center"/>
+          </w:tcPr>
+          <w:p>
+            <w:pPr>
+              <w:jc w:val="left"/>
               <w:rPr>
                 <w:sz w:val="24"/>
                 <w:szCs w:val="24"/>
@@ -6358,11 +6500,12 @@
       </w:tr>
       <w:tr>
         <w:trPr>
+          <w:cantSplit/>
           <w:jc w:val="center"/>
         </w:trPr>
         <w:tc>
           <w:tcPr>
-            <w:tcW w:w="3367" w:type="dxa"/>
+            <w:tcW w:w="4309" w:type="dxa"/>
             <w:tcBorders>
               <w:top w:val="single" w:sz="8" w:space="0" w:color="000000"/>
               <w:left w:val="single" w:sz="8" w:space="0" w:color="000000"/>
@@ -6390,7 +6533,7 @@
         </w:tc>
         <w:tc>
           <w:tcPr>
-            <w:tcW w:w="2248" w:type="dxa"/>
+            <w:tcW w:w="1927" w:type="dxa"/>
             <w:tcBorders>
               <w:top w:val="single" w:sz="8" w:space="0" w:color="000000"/>
               <w:left w:val="single" w:sz="8" w:space="0" w:color="000000"/>
@@ -6418,18 +6561,18 @@
         </w:tc>
         <w:tc>
           <w:tcPr>
-            <w:tcW w:w="3913" w:type="dxa"/>
-            <w:tcBorders>
-              <w:top w:val="single" w:sz="8" w:space="0" w:color="000000"/>
-              <w:left w:val="single" w:sz="8" w:space="0" w:color="000000"/>
-              <w:bottom w:val="single" w:sz="8" w:space="0" w:color="000000"/>
-              <w:right w:val="single" w:sz="8" w:space="0" w:color="000000"/>
-            </w:tcBorders>
-            <w:vAlign w:val="center"/>
-          </w:tcPr>
-          <w:p>
-            <w:pPr>
-              <w:jc w:val="both"/>
+            <w:tcW w:w="2835" w:type="dxa"/>
+            <w:tcBorders>
+              <w:top w:val="single" w:sz="8" w:space="0" w:color="000000"/>
+              <w:left w:val="single" w:sz="8" w:space="0" w:color="000000"/>
+              <w:bottom w:val="single" w:sz="8" w:space="0" w:color="000000"/>
+              <w:right w:val="single" w:sz="8" w:space="0" w:color="000000"/>
+            </w:tcBorders>
+            <w:vAlign w:val="center"/>
+          </w:tcPr>
+          <w:p>
+            <w:pPr>
+              <w:jc w:val="left"/>
               <w:rPr>
                 <w:sz w:val="24"/>
                 <w:szCs w:val="24"/>
@@ -6448,11 +6591,12 @@
       </w:tr>
       <w:tr>
         <w:trPr>
+          <w:cantSplit/>
           <w:jc w:val="center"/>
         </w:trPr>
         <w:tc>
           <w:tcPr>
-            <w:tcW w:w="3367" w:type="dxa"/>
+            <w:tcW w:w="4309" w:type="dxa"/>
             <w:tcBorders>
               <w:top w:val="single" w:sz="8" w:space="0" w:color="000000"/>
               <w:left w:val="single" w:sz="8" w:space="0" w:color="000000"/>
@@ -6480,7 +6624,7 @@
         </w:tc>
         <w:tc>
           <w:tcPr>
-            <w:tcW w:w="2248" w:type="dxa"/>
+            <w:tcW w:w="1927" w:type="dxa"/>
             <w:tcBorders>
               <w:top w:val="single" w:sz="8" w:space="0" w:color="000000"/>
               <w:left w:val="single" w:sz="8" w:space="0" w:color="000000"/>
@@ -6508,18 +6652,18 @@
         </w:tc>
         <w:tc>
           <w:tcPr>
-            <w:tcW w:w="3913" w:type="dxa"/>
-            <w:tcBorders>
-              <w:top w:val="single" w:sz="8" w:space="0" w:color="000000"/>
-              <w:left w:val="single" w:sz="8" w:space="0" w:color="000000"/>
-              <w:bottom w:val="single" w:sz="8" w:space="0" w:color="000000"/>
-              <w:right w:val="single" w:sz="8" w:space="0" w:color="000000"/>
-            </w:tcBorders>
-            <w:vAlign w:val="center"/>
-          </w:tcPr>
-          <w:p>
-            <w:pPr>
-              <w:jc w:val="both"/>
+            <w:tcW w:w="2835" w:type="dxa"/>
+            <w:tcBorders>
+              <w:top w:val="single" w:sz="8" w:space="0" w:color="000000"/>
+              <w:left w:val="single" w:sz="8" w:space="0" w:color="000000"/>
+              <w:bottom w:val="single" w:sz="8" w:space="0" w:color="000000"/>
+              <w:right w:val="single" w:sz="8" w:space="0" w:color="000000"/>
+            </w:tcBorders>
+            <w:vAlign w:val="center"/>
+          </w:tcPr>
+          <w:p>
+            <w:pPr>
+              <w:jc w:val="left"/>
               <w:rPr>
                 <w:sz w:val="24"/>
                 <w:szCs w:val="24"/>
@@ -6538,11 +6682,12 @@
       </w:tr>
       <w:tr>
         <w:trPr>
+          <w:cantSplit/>
           <w:jc w:val="center"/>
         </w:trPr>
         <w:tc>
           <w:tcPr>
-            <w:tcW w:w="3367" w:type="dxa"/>
+            <w:tcW w:w="4309" w:type="dxa"/>
             <w:tcBorders>
               <w:top w:val="single" w:sz="8" w:space="0" w:color="000000"/>
               <w:left w:val="single" w:sz="8" w:space="0" w:color="000000"/>
@@ -6570,7 +6715,7 @@
         </w:tc>
         <w:tc>
           <w:tcPr>
-            <w:tcW w:w="2248" w:type="dxa"/>
+            <w:tcW w:w="1927" w:type="dxa"/>
             <w:tcBorders>
               <w:top w:val="single" w:sz="8" w:space="0" w:color="000000"/>
               <w:left w:val="single" w:sz="8" w:space="0" w:color="000000"/>
@@ -6598,18 +6743,18 @@
         </w:tc>
         <w:tc>
           <w:tcPr>
-            <w:tcW w:w="3913" w:type="dxa"/>
-            <w:tcBorders>
-              <w:top w:val="single" w:sz="8" w:space="0" w:color="000000"/>
-              <w:left w:val="single" w:sz="8" w:space="0" w:color="000000"/>
-              <w:bottom w:val="single" w:sz="8" w:space="0" w:color="000000"/>
-              <w:right w:val="single" w:sz="8" w:space="0" w:color="000000"/>
-            </w:tcBorders>
-            <w:vAlign w:val="center"/>
-          </w:tcPr>
-          <w:p>
-            <w:pPr>
-              <w:jc w:val="both"/>
+            <w:tcW w:w="2835" w:type="dxa"/>
+            <w:tcBorders>
+              <w:top w:val="single" w:sz="8" w:space="0" w:color="000000"/>
+              <w:left w:val="single" w:sz="8" w:space="0" w:color="000000"/>
+              <w:bottom w:val="single" w:sz="8" w:space="0" w:color="000000"/>
+              <w:right w:val="single" w:sz="8" w:space="0" w:color="000000"/>
+            </w:tcBorders>
+            <w:vAlign w:val="center"/>
+          </w:tcPr>
+          <w:p>
+            <w:pPr>
+              <w:jc w:val="left"/>
               <w:rPr>
                 <w:sz w:val="24"/>
                 <w:szCs w:val="24"/>
@@ -6628,11 +6773,12 @@
       </w:tr>
       <w:tr>
         <w:trPr>
+          <w:cantSplit/>
           <w:jc w:val="center"/>
         </w:trPr>
         <w:tc>
           <w:tcPr>
-            <w:tcW w:w="3367" w:type="dxa"/>
+            <w:tcW w:w="4309" w:type="dxa"/>
             <w:tcBorders>
               <w:top w:val="single" w:sz="8" w:space="0" w:color="000000"/>
               <w:left w:val="single" w:sz="8" w:space="0" w:color="000000"/>
@@ -6660,7 +6806,7 @@
         </w:tc>
         <w:tc>
           <w:tcPr>
-            <w:tcW w:w="2248" w:type="dxa"/>
+            <w:tcW w:w="1927" w:type="dxa"/>
             <w:tcBorders>
               <w:top w:val="single" w:sz="8" w:space="0" w:color="000000"/>
               <w:left w:val="single" w:sz="8" w:space="0" w:color="000000"/>
@@ -6688,18 +6834,18 @@
         </w:tc>
         <w:tc>
           <w:tcPr>
-            <w:tcW w:w="3913" w:type="dxa"/>
-            <w:tcBorders>
-              <w:top w:val="single" w:sz="8" w:space="0" w:color="000000"/>
-              <w:left w:val="single" w:sz="8" w:space="0" w:color="000000"/>
-              <w:bottom w:val="single" w:sz="8" w:space="0" w:color="000000"/>
-              <w:right w:val="single" w:sz="8" w:space="0" w:color="000000"/>
-            </w:tcBorders>
-            <w:vAlign w:val="center"/>
-          </w:tcPr>
-          <w:p>
-            <w:pPr>
-              <w:jc w:val="both"/>
+            <w:tcW w:w="2835" w:type="dxa"/>
+            <w:tcBorders>
+              <w:top w:val="single" w:sz="8" w:space="0" w:color="000000"/>
+              <w:left w:val="single" w:sz="8" w:space="0" w:color="000000"/>
+              <w:bottom w:val="single" w:sz="8" w:space="0" w:color="000000"/>
+              <w:right w:val="single" w:sz="8" w:space="0" w:color="000000"/>
+            </w:tcBorders>
+            <w:vAlign w:val="center"/>
+          </w:tcPr>
+          <w:p>
+            <w:pPr>
+              <w:jc w:val="left"/>
               <w:rPr>
                 <w:sz w:val="24"/>
                 <w:szCs w:val="24"/>
@@ -6718,11 +6864,12 @@
       </w:tr>
       <w:tr>
         <w:trPr>
+          <w:cantSplit/>
           <w:jc w:val="center"/>
         </w:trPr>
         <w:tc>
           <w:tcPr>
-            <w:tcW w:w="3367" w:type="dxa"/>
+            <w:tcW w:w="4309" w:type="dxa"/>
             <w:tcBorders>
               <w:top w:val="single" w:sz="8" w:space="0" w:color="000000"/>
               <w:left w:val="single" w:sz="8" w:space="0" w:color="000000"/>
@@ -6750,7 +6897,7 @@
         </w:tc>
         <w:tc>
           <w:tcPr>
-            <w:tcW w:w="2248" w:type="dxa"/>
+            <w:tcW w:w="1927" w:type="dxa"/>
             <w:tcBorders>
               <w:top w:val="single" w:sz="8" w:space="0" w:color="000000"/>
               <w:left w:val="single" w:sz="8" w:space="0" w:color="000000"/>
@@ -6778,18 +6925,18 @@
         </w:tc>
         <w:tc>
           <w:tcPr>
-            <w:tcW w:w="3913" w:type="dxa"/>
-            <w:tcBorders>
-              <w:top w:val="single" w:sz="8" w:space="0" w:color="000000"/>
-              <w:left w:val="single" w:sz="8" w:space="0" w:color="000000"/>
-              <w:bottom w:val="single" w:sz="8" w:space="0" w:color="000000"/>
-              <w:right w:val="single" w:sz="8" w:space="0" w:color="000000"/>
-            </w:tcBorders>
-            <w:vAlign w:val="center"/>
-          </w:tcPr>
-          <w:p>
-            <w:pPr>
-              <w:jc w:val="both"/>
+            <w:tcW w:w="2835" w:type="dxa"/>
+            <w:tcBorders>
+              <w:top w:val="single" w:sz="8" w:space="0" w:color="000000"/>
+              <w:left w:val="single" w:sz="8" w:space="0" w:color="000000"/>
+              <w:bottom w:val="single" w:sz="8" w:space="0" w:color="000000"/>
+              <w:right w:val="single" w:sz="8" w:space="0" w:color="000000"/>
+            </w:tcBorders>
+            <w:vAlign w:val="center"/>
+          </w:tcPr>
+          <w:p>
+            <w:pPr>
+              <w:jc w:val="left"/>
               <w:rPr>
                 <w:sz w:val="24"/>
                 <w:szCs w:val="24"/>
@@ -6846,6 +6993,7 @@
     </w:p>
     <w:p>
       <w:pPr>
+        <w:keepNext/>
         <w:pBdr>
           <w:top w:val="nil"/>
           <w:left w:val="nil"/>
@@ -6878,27 +7026,30 @@
         <w:tblLook w:val="0400" w:firstRow="0" w:lastRow="0" w:firstColumn="0" w:lastColumn="0" w:noHBand="0" w:noVBand="1"/>
       </w:tblPr>
       <w:tblGrid>
-        <w:gridCol w:w="3367"/>
-        <w:gridCol w:w="2248"/>
-        <w:gridCol w:w="3913"/>
+        <w:gridCol w:w="4309"/>
+        <w:gridCol w:w="1927"/>
+        <w:gridCol w:w="2835"/>
       </w:tblGrid>
       <w:tr>
         <w:trPr>
+          <w:cantSplit/>
+          <w:tblHeader/>
           <w:jc w:val="center"/>
         </w:trPr>
         <w:tc>
           <w:tcPr>
-            <w:tcW w:w="3367" w:type="dxa"/>
-            <w:tcBorders>
-              <w:top w:val="single" w:sz="8" w:space="0" w:color="000000"/>
-              <w:left w:val="single" w:sz="8" w:space="0" w:color="000000"/>
-              <w:bottom w:val="single" w:sz="8" w:space="0" w:color="000000"/>
-              <w:right w:val="single" w:sz="8" w:space="0" w:color="000000"/>
-            </w:tcBorders>
-            <w:vAlign w:val="center"/>
-          </w:tcPr>
-          <w:p>
-            <w:pPr>
+            <w:tcW w:w="4309" w:type="dxa"/>
+            <w:tcBorders>
+              <w:top w:val="single" w:sz="8" w:space="0" w:color="000000"/>
+              <w:left w:val="single" w:sz="8" w:space="0" w:color="000000"/>
+              <w:bottom w:val="single" w:sz="8" w:space="0" w:color="000000"/>
+              <w:right w:val="single" w:sz="8" w:space="0" w:color="000000"/>
+            </w:tcBorders>
+            <w:vAlign w:val="center"/>
+          </w:tcPr>
+          <w:p>
+            <w:pPr>
+              <w:keepNext/>
               <w:jc w:val="center"/>
               <w:rPr>
                 <w:sz w:val="24"/>
@@ -6918,17 +7069,18 @@
         </w:tc>
         <w:tc>
           <w:tcPr>
-            <w:tcW w:w="2248" w:type="dxa"/>
-            <w:tcBorders>
-              <w:top w:val="single" w:sz="8" w:space="0" w:color="000000"/>
-              <w:left w:val="single" w:sz="8" w:space="0" w:color="000000"/>
-              <w:bottom w:val="single" w:sz="8" w:space="0" w:color="000000"/>
-              <w:right w:val="single" w:sz="8" w:space="0" w:color="000000"/>
-            </w:tcBorders>
-            <w:vAlign w:val="center"/>
-          </w:tcPr>
-          <w:p>
-            <w:pPr>
+            <w:tcW w:w="1927" w:type="dxa"/>
+            <w:tcBorders>
+              <w:top w:val="single" w:sz="8" w:space="0" w:color="000000"/>
+              <w:left w:val="single" w:sz="8" w:space="0" w:color="000000"/>
+              <w:bottom w:val="single" w:sz="8" w:space="0" w:color="000000"/>
+              <w:right w:val="single" w:sz="8" w:space="0" w:color="000000"/>
+            </w:tcBorders>
+            <w:vAlign w:val="center"/>
+          </w:tcPr>
+          <w:p>
+            <w:pPr>
+              <w:keepNext/>
               <w:jc w:val="center"/>
               <w:rPr>
                 <w:sz w:val="24"/>
@@ -6948,17 +7100,18 @@
         </w:tc>
         <w:tc>
           <w:tcPr>
-            <w:tcW w:w="3913" w:type="dxa"/>
-            <w:tcBorders>
-              <w:top w:val="single" w:sz="8" w:space="0" w:color="000000"/>
-              <w:left w:val="single" w:sz="8" w:space="0" w:color="000000"/>
-              <w:bottom w:val="single" w:sz="8" w:space="0" w:color="000000"/>
-              <w:right w:val="single" w:sz="8" w:space="0" w:color="000000"/>
-            </w:tcBorders>
-            <w:vAlign w:val="center"/>
-          </w:tcPr>
-          <w:p>
-            <w:pPr>
+            <w:tcW w:w="2835" w:type="dxa"/>
+            <w:tcBorders>
+              <w:top w:val="single" w:sz="8" w:space="0" w:color="000000"/>
+              <w:left w:val="single" w:sz="8" w:space="0" w:color="000000"/>
+              <w:bottom w:val="single" w:sz="8" w:space="0" w:color="000000"/>
+              <w:right w:val="single" w:sz="8" w:space="0" w:color="000000"/>
+            </w:tcBorders>
+            <w:vAlign w:val="center"/>
+          </w:tcPr>
+          <w:p>
+            <w:pPr>
+              <w:keepNext/>
               <w:jc w:val="center"/>
               <w:rPr>
                 <w:sz w:val="24"/>
@@ -6979,11 +7132,12 @@
       </w:tr>
       <w:tr>
         <w:trPr>
+          <w:cantSplit/>
           <w:jc w:val="center"/>
         </w:trPr>
         <w:tc>
           <w:tcPr>
-            <w:tcW w:w="3367" w:type="dxa"/>
+            <w:tcW w:w="4309" w:type="dxa"/>
             <w:tcBorders>
               <w:top w:val="single" w:sz="8" w:space="0" w:color="000000"/>
               <w:left w:val="single" w:sz="8" w:space="0" w:color="000000"/>
@@ -7011,7 +7165,7 @@
         </w:tc>
         <w:tc>
           <w:tcPr>
-            <w:tcW w:w="2248" w:type="dxa"/>
+            <w:tcW w:w="1927" w:type="dxa"/>
             <w:tcBorders>
               <w:top w:val="single" w:sz="8" w:space="0" w:color="000000"/>
               <w:left w:val="single" w:sz="8" w:space="0" w:color="000000"/>
@@ -7039,18 +7193,18 @@
         </w:tc>
         <w:tc>
           <w:tcPr>
-            <w:tcW w:w="3913" w:type="dxa"/>
-            <w:tcBorders>
-              <w:top w:val="single" w:sz="8" w:space="0" w:color="000000"/>
-              <w:left w:val="single" w:sz="8" w:space="0" w:color="000000"/>
-              <w:bottom w:val="single" w:sz="8" w:space="0" w:color="000000"/>
-              <w:right w:val="single" w:sz="8" w:space="0" w:color="000000"/>
-            </w:tcBorders>
-            <w:vAlign w:val="center"/>
-          </w:tcPr>
-          <w:p>
-            <w:pPr>
-              <w:jc w:val="both"/>
+            <w:tcW w:w="2835" w:type="dxa"/>
+            <w:tcBorders>
+              <w:top w:val="single" w:sz="8" w:space="0" w:color="000000"/>
+              <w:left w:val="single" w:sz="8" w:space="0" w:color="000000"/>
+              <w:bottom w:val="single" w:sz="8" w:space="0" w:color="000000"/>
+              <w:right w:val="single" w:sz="8" w:space="0" w:color="000000"/>
+            </w:tcBorders>
+            <w:vAlign w:val="center"/>
+          </w:tcPr>
+          <w:p>
+            <w:pPr>
+              <w:jc w:val="left"/>
               <w:rPr>
                 <w:sz w:val="24"/>
                 <w:szCs w:val="24"/>
@@ -7069,11 +7223,12 @@
       </w:tr>
       <w:tr>
         <w:trPr>
+          <w:cantSplit/>
           <w:jc w:val="center"/>
         </w:trPr>
         <w:tc>
           <w:tcPr>
-            <w:tcW w:w="3367" w:type="dxa"/>
+            <w:tcW w:w="4309" w:type="dxa"/>
             <w:tcBorders>
               <w:top w:val="single" w:sz="8" w:space="0" w:color="000000"/>
               <w:left w:val="single" w:sz="8" w:space="0" w:color="000000"/>
@@ -7101,7 +7256,7 @@
         </w:tc>
         <w:tc>
           <w:tcPr>
-            <w:tcW w:w="2248" w:type="dxa"/>
+            <w:tcW w:w="1927" w:type="dxa"/>
             <w:tcBorders>
               <w:top w:val="single" w:sz="8" w:space="0" w:color="000000"/>
               <w:left w:val="single" w:sz="8" w:space="0" w:color="000000"/>
@@ -7129,18 +7284,18 @@
         </w:tc>
         <w:tc>
           <w:tcPr>
-            <w:tcW w:w="3913" w:type="dxa"/>
-            <w:tcBorders>
-              <w:top w:val="single" w:sz="8" w:space="0" w:color="000000"/>
-              <w:left w:val="single" w:sz="8" w:space="0" w:color="000000"/>
-              <w:bottom w:val="single" w:sz="8" w:space="0" w:color="000000"/>
-              <w:right w:val="single" w:sz="8" w:space="0" w:color="000000"/>
-            </w:tcBorders>
-            <w:vAlign w:val="center"/>
-          </w:tcPr>
-          <w:p>
-            <w:pPr>
-              <w:jc w:val="both"/>
+            <w:tcW w:w="2835" w:type="dxa"/>
+            <w:tcBorders>
+              <w:top w:val="single" w:sz="8" w:space="0" w:color="000000"/>
+              <w:left w:val="single" w:sz="8" w:space="0" w:color="000000"/>
+              <w:bottom w:val="single" w:sz="8" w:space="0" w:color="000000"/>
+              <w:right w:val="single" w:sz="8" w:space="0" w:color="000000"/>
+            </w:tcBorders>
+            <w:vAlign w:val="center"/>
+          </w:tcPr>
+          <w:p>
+            <w:pPr>
+              <w:jc w:val="left"/>
               <w:rPr>
                 <w:sz w:val="24"/>
                 <w:szCs w:val="24"/>
@@ -7159,11 +7314,12 @@
       </w:tr>
       <w:tr>
         <w:trPr>
+          <w:cantSplit/>
           <w:jc w:val="center"/>
         </w:trPr>
         <w:tc>
           <w:tcPr>
-            <w:tcW w:w="3367" w:type="dxa"/>
+            <w:tcW w:w="4309" w:type="dxa"/>
             <w:tcBorders>
               <w:top w:val="single" w:sz="8" w:space="0" w:color="000000"/>
               <w:left w:val="single" w:sz="8" w:space="0" w:color="000000"/>
@@ -7191,7 +7347,7 @@
         </w:tc>
         <w:tc>
           <w:tcPr>
-            <w:tcW w:w="2248" w:type="dxa"/>
+            <w:tcW w:w="1927" w:type="dxa"/>
             <w:tcBorders>
               <w:top w:val="single" w:sz="8" w:space="0" w:color="000000"/>
               <w:left w:val="single" w:sz="8" w:space="0" w:color="000000"/>
@@ -7219,18 +7375,18 @@
         </w:tc>
         <w:tc>
           <w:tcPr>
-            <w:tcW w:w="3913" w:type="dxa"/>
-            <w:tcBorders>
-              <w:top w:val="single" w:sz="8" w:space="0" w:color="000000"/>
-              <w:left w:val="single" w:sz="8" w:space="0" w:color="000000"/>
-              <w:bottom w:val="single" w:sz="8" w:space="0" w:color="000000"/>
-              <w:right w:val="single" w:sz="8" w:space="0" w:color="000000"/>
-            </w:tcBorders>
-            <w:vAlign w:val="center"/>
-          </w:tcPr>
-          <w:p>
-            <w:pPr>
-              <w:jc w:val="both"/>
+            <w:tcW w:w="2835" w:type="dxa"/>
+            <w:tcBorders>
+              <w:top w:val="single" w:sz="8" w:space="0" w:color="000000"/>
+              <w:left w:val="single" w:sz="8" w:space="0" w:color="000000"/>
+              <w:bottom w:val="single" w:sz="8" w:space="0" w:color="000000"/>
+              <w:right w:val="single" w:sz="8" w:space="0" w:color="000000"/>
+            </w:tcBorders>
+            <w:vAlign w:val="center"/>
+          </w:tcPr>
+          <w:p>
+            <w:pPr>
+              <w:jc w:val="left"/>
               <w:rPr>
                 <w:sz w:val="24"/>
                 <w:szCs w:val="24"/>
@@ -7249,11 +7405,12 @@
       </w:tr>
       <w:tr>
         <w:trPr>
+          <w:cantSplit/>
           <w:jc w:val="center"/>
         </w:trPr>
         <w:tc>
           <w:tcPr>
-            <w:tcW w:w="3367" w:type="dxa"/>
+            <w:tcW w:w="4309" w:type="dxa"/>
             <w:tcBorders>
               <w:top w:val="single" w:sz="8" w:space="0" w:color="000000"/>
               <w:left w:val="single" w:sz="8" w:space="0" w:color="000000"/>
@@ -7281,7 +7438,7 @@
         </w:tc>
         <w:tc>
           <w:tcPr>
-            <w:tcW w:w="2248" w:type="dxa"/>
+            <w:tcW w:w="1927" w:type="dxa"/>
             <w:tcBorders>
               <w:top w:val="single" w:sz="8" w:space="0" w:color="000000"/>
               <w:left w:val="single" w:sz="8" w:space="0" w:color="000000"/>
@@ -7309,18 +7466,18 @@
         </w:tc>
         <w:tc>
           <w:tcPr>
-            <w:tcW w:w="3913" w:type="dxa"/>
-            <w:tcBorders>
-              <w:top w:val="single" w:sz="8" w:space="0" w:color="000000"/>
-              <w:left w:val="single" w:sz="8" w:space="0" w:color="000000"/>
-              <w:bottom w:val="single" w:sz="8" w:space="0" w:color="000000"/>
-              <w:right w:val="single" w:sz="8" w:space="0" w:color="000000"/>
-            </w:tcBorders>
-            <w:vAlign w:val="center"/>
-          </w:tcPr>
-          <w:p>
-            <w:pPr>
-              <w:jc w:val="both"/>
+            <w:tcW w:w="2835" w:type="dxa"/>
+            <w:tcBorders>
+              <w:top w:val="single" w:sz="8" w:space="0" w:color="000000"/>
+              <w:left w:val="single" w:sz="8" w:space="0" w:color="000000"/>
+              <w:bottom w:val="single" w:sz="8" w:space="0" w:color="000000"/>
+              <w:right w:val="single" w:sz="8" w:space="0" w:color="000000"/>
+            </w:tcBorders>
+            <w:vAlign w:val="center"/>
+          </w:tcPr>
+          <w:p>
+            <w:pPr>
+              <w:jc w:val="left"/>
               <w:rPr>
                 <w:sz w:val="24"/>
                 <w:szCs w:val="24"/>
@@ -7339,11 +7496,12 @@
       </w:tr>
       <w:tr>
         <w:trPr>
+          <w:cantSplit/>
           <w:jc w:val="center"/>
         </w:trPr>
         <w:tc>
           <w:tcPr>
-            <w:tcW w:w="3367" w:type="dxa"/>
+            <w:tcW w:w="4309" w:type="dxa"/>
             <w:tcBorders>
               <w:top w:val="single" w:sz="8" w:space="0" w:color="000000"/>
               <w:left w:val="single" w:sz="8" w:space="0" w:color="000000"/>
@@ -7371,7 +7529,7 @@
         </w:tc>
         <w:tc>
           <w:tcPr>
-            <w:tcW w:w="2248" w:type="dxa"/>
+            <w:tcW w:w="1927" w:type="dxa"/>
             <w:tcBorders>
               <w:top w:val="single" w:sz="8" w:space="0" w:color="000000"/>
               <w:left w:val="single" w:sz="8" w:space="0" w:color="000000"/>
@@ -7399,18 +7557,18 @@
         </w:tc>
         <w:tc>
           <w:tcPr>
-            <w:tcW w:w="3913" w:type="dxa"/>
-            <w:tcBorders>
-              <w:top w:val="single" w:sz="8" w:space="0" w:color="000000"/>
-              <w:left w:val="single" w:sz="8" w:space="0" w:color="000000"/>
-              <w:bottom w:val="single" w:sz="8" w:space="0" w:color="000000"/>
-              <w:right w:val="single" w:sz="8" w:space="0" w:color="000000"/>
-            </w:tcBorders>
-            <w:vAlign w:val="center"/>
-          </w:tcPr>
-          <w:p>
-            <w:pPr>
-              <w:jc w:val="both"/>
+            <w:tcW w:w="2835" w:type="dxa"/>
+            <w:tcBorders>
+              <w:top w:val="single" w:sz="8" w:space="0" w:color="000000"/>
+              <w:left w:val="single" w:sz="8" w:space="0" w:color="000000"/>
+              <w:bottom w:val="single" w:sz="8" w:space="0" w:color="000000"/>
+              <w:right w:val="single" w:sz="8" w:space="0" w:color="000000"/>
+            </w:tcBorders>
+            <w:vAlign w:val="center"/>
+          </w:tcPr>
+          <w:p>
+            <w:pPr>
+              <w:jc w:val="left"/>
               <w:rPr>
                 <w:sz w:val="24"/>
                 <w:szCs w:val="24"/>
@@ -7467,6 +7625,7 @@
     </w:p>
     <w:p>
       <w:pPr>
+        <w:keepNext/>
         <w:pBdr>
           <w:top w:val="nil"/>
           <w:left w:val="nil"/>
@@ -7486,7 +7645,7 @@
           <w:sz w:val="24"/>
           <w:szCs w:val="24"/>
         </w:rPr>
-        <w:t xml:space="preserve">Prosedur ini berlaku sebelum dan sesudah penawaran dikirim, bila customer meminta atau penawaran memuat pengecualian komersial. Pihak yang memutuskan ditetapkan di butir 4.10.</w:t>
+        <w:t xml:space="preserve">Prosedur ini berlaku sebelum dan setelah penawaran dikirim, jika customer meminta atau penawaran memuat pengecualian komersial. Pihak yang memutuskan ditetapkan di butir 4.10.</w:t>
       </w:r>
     </w:p>
     <w:tbl>
@@ -7499,27 +7658,30 @@
         <w:tblLook w:val="0400" w:firstRow="0" w:lastRow="0" w:firstColumn="0" w:lastColumn="0" w:noHBand="0" w:noVBand="1"/>
       </w:tblPr>
       <w:tblGrid>
-        <w:gridCol w:w="3367"/>
-        <w:gridCol w:w="2248"/>
-        <w:gridCol w:w="3913"/>
+        <w:gridCol w:w="4309"/>
+        <w:gridCol w:w="1927"/>
+        <w:gridCol w:w="2835"/>
       </w:tblGrid>
       <w:tr>
         <w:trPr>
+          <w:cantSplit/>
+          <w:tblHeader/>
           <w:jc w:val="center"/>
         </w:trPr>
         <w:tc>
           <w:tcPr>
-            <w:tcW w:w="3367" w:type="dxa"/>
-            <w:tcBorders>
-              <w:top w:val="single" w:sz="8" w:space="0" w:color="000000"/>
-              <w:left w:val="single" w:sz="8" w:space="0" w:color="000000"/>
-              <w:bottom w:val="single" w:sz="8" w:space="0" w:color="000000"/>
-              <w:right w:val="single" w:sz="8" w:space="0" w:color="000000"/>
-            </w:tcBorders>
-            <w:vAlign w:val="center"/>
-          </w:tcPr>
-          <w:p>
-            <w:pPr>
+            <w:tcW w:w="4309" w:type="dxa"/>
+            <w:tcBorders>
+              <w:top w:val="single" w:sz="8" w:space="0" w:color="000000"/>
+              <w:left w:val="single" w:sz="8" w:space="0" w:color="000000"/>
+              <w:bottom w:val="single" w:sz="8" w:space="0" w:color="000000"/>
+              <w:right w:val="single" w:sz="8" w:space="0" w:color="000000"/>
+            </w:tcBorders>
+            <w:vAlign w:val="center"/>
+          </w:tcPr>
+          <w:p>
+            <w:pPr>
+              <w:keepNext/>
               <w:jc w:val="center"/>
               <w:rPr>
                 <w:sz w:val="24"/>
@@ -7539,17 +7701,18 @@
         </w:tc>
         <w:tc>
           <w:tcPr>
-            <w:tcW w:w="2248" w:type="dxa"/>
-            <w:tcBorders>
-              <w:top w:val="single" w:sz="8" w:space="0" w:color="000000"/>
-              <w:left w:val="single" w:sz="8" w:space="0" w:color="000000"/>
-              <w:bottom w:val="single" w:sz="8" w:space="0" w:color="000000"/>
-              <w:right w:val="single" w:sz="8" w:space="0" w:color="000000"/>
-            </w:tcBorders>
-            <w:vAlign w:val="center"/>
-          </w:tcPr>
-          <w:p>
-            <w:pPr>
+            <w:tcW w:w="1927" w:type="dxa"/>
+            <w:tcBorders>
+              <w:top w:val="single" w:sz="8" w:space="0" w:color="000000"/>
+              <w:left w:val="single" w:sz="8" w:space="0" w:color="000000"/>
+              <w:bottom w:val="single" w:sz="8" w:space="0" w:color="000000"/>
+              <w:right w:val="single" w:sz="8" w:space="0" w:color="000000"/>
+            </w:tcBorders>
+            <w:vAlign w:val="center"/>
+          </w:tcPr>
+          <w:p>
+            <w:pPr>
+              <w:keepNext/>
               <w:jc w:val="center"/>
               <w:rPr>
                 <w:sz w:val="24"/>
@@ -7569,17 +7732,18 @@
         </w:tc>
         <w:tc>
           <w:tcPr>
-            <w:tcW w:w="3913" w:type="dxa"/>
-            <w:tcBorders>
-              <w:top w:val="single" w:sz="8" w:space="0" w:color="000000"/>
-              <w:left w:val="single" w:sz="8" w:space="0" w:color="000000"/>
-              <w:bottom w:val="single" w:sz="8" w:space="0" w:color="000000"/>
-              <w:right w:val="single" w:sz="8" w:space="0" w:color="000000"/>
-            </w:tcBorders>
-            <w:vAlign w:val="center"/>
-          </w:tcPr>
-          <w:p>
-            <w:pPr>
+            <w:tcW w:w="2835" w:type="dxa"/>
+            <w:tcBorders>
+              <w:top w:val="single" w:sz="8" w:space="0" w:color="000000"/>
+              <w:left w:val="single" w:sz="8" w:space="0" w:color="000000"/>
+              <w:bottom w:val="single" w:sz="8" w:space="0" w:color="000000"/>
+              <w:right w:val="single" w:sz="8" w:space="0" w:color="000000"/>
+            </w:tcBorders>
+            <w:vAlign w:val="center"/>
+          </w:tcPr>
+          <w:p>
+            <w:pPr>
+              <w:keepNext/>
               <w:jc w:val="center"/>
               <w:rPr>
                 <w:sz w:val="24"/>
@@ -7600,11 +7764,12 @@
       </w:tr>
       <w:tr>
         <w:trPr>
+          <w:cantSplit/>
           <w:jc w:val="center"/>
         </w:trPr>
         <w:tc>
           <w:tcPr>
-            <w:tcW w:w="3367" w:type="dxa"/>
+            <w:tcW w:w="4309" w:type="dxa"/>
             <w:tcBorders>
               <w:top w:val="single" w:sz="8" w:space="0" w:color="000000"/>
               <w:left w:val="single" w:sz="8" w:space="0" w:color="000000"/>
@@ -7632,7 +7797,7 @@
         </w:tc>
         <w:tc>
           <w:tcPr>
-            <w:tcW w:w="2248" w:type="dxa"/>
+            <w:tcW w:w="1927" w:type="dxa"/>
             <w:tcBorders>
               <w:top w:val="single" w:sz="8" w:space="0" w:color="000000"/>
               <w:left w:val="single" w:sz="8" w:space="0" w:color="000000"/>
@@ -7660,18 +7825,18 @@
         </w:tc>
         <w:tc>
           <w:tcPr>
-            <w:tcW w:w="3913" w:type="dxa"/>
-            <w:tcBorders>
-              <w:top w:val="single" w:sz="8" w:space="0" w:color="000000"/>
-              <w:left w:val="single" w:sz="8" w:space="0" w:color="000000"/>
-              <w:bottom w:val="single" w:sz="8" w:space="0" w:color="000000"/>
-              <w:right w:val="single" w:sz="8" w:space="0" w:color="000000"/>
-            </w:tcBorders>
-            <w:vAlign w:val="center"/>
-          </w:tcPr>
-          <w:p>
-            <w:pPr>
-              <w:jc w:val="both"/>
+            <w:tcW w:w="2835" w:type="dxa"/>
+            <w:tcBorders>
+              <w:top w:val="single" w:sz="8" w:space="0" w:color="000000"/>
+              <w:left w:val="single" w:sz="8" w:space="0" w:color="000000"/>
+              <w:bottom w:val="single" w:sz="8" w:space="0" w:color="000000"/>
+              <w:right w:val="single" w:sz="8" w:space="0" w:color="000000"/>
+            </w:tcBorders>
+            <w:vAlign w:val="center"/>
+          </w:tcPr>
+          <w:p>
+            <w:pPr>
+              <w:jc w:val="left"/>
               <w:rPr>
                 <w:sz w:val="24"/>
                 <w:szCs w:val="24"/>
@@ -7690,11 +7855,12 @@
       </w:tr>
       <w:tr>
         <w:trPr>
+          <w:cantSplit/>
           <w:jc w:val="center"/>
         </w:trPr>
         <w:tc>
           <w:tcPr>
-            <w:tcW w:w="3367" w:type="dxa"/>
+            <w:tcW w:w="4309" w:type="dxa"/>
             <w:tcBorders>
               <w:top w:val="single" w:sz="8" w:space="0" w:color="000000"/>
               <w:left w:val="single" w:sz="8" w:space="0" w:color="000000"/>
@@ -7722,7 +7888,7 @@
         </w:tc>
         <w:tc>
           <w:tcPr>
-            <w:tcW w:w="2248" w:type="dxa"/>
+            <w:tcW w:w="1927" w:type="dxa"/>
             <w:tcBorders>
               <w:top w:val="single" w:sz="8" w:space="0" w:color="000000"/>
               <w:left w:val="single" w:sz="8" w:space="0" w:color="000000"/>
@@ -7750,18 +7916,18 @@
         </w:tc>
         <w:tc>
           <w:tcPr>
-            <w:tcW w:w="3913" w:type="dxa"/>
-            <w:tcBorders>
-              <w:top w:val="single" w:sz="8" w:space="0" w:color="000000"/>
-              <w:left w:val="single" w:sz="8" w:space="0" w:color="000000"/>
-              <w:bottom w:val="single" w:sz="8" w:space="0" w:color="000000"/>
-              <w:right w:val="single" w:sz="8" w:space="0" w:color="000000"/>
-            </w:tcBorders>
-            <w:vAlign w:val="center"/>
-          </w:tcPr>
-          <w:p>
-            <w:pPr>
-              <w:jc w:val="both"/>
+            <w:tcW w:w="2835" w:type="dxa"/>
+            <w:tcBorders>
+              <w:top w:val="single" w:sz="8" w:space="0" w:color="000000"/>
+              <w:left w:val="single" w:sz="8" w:space="0" w:color="000000"/>
+              <w:bottom w:val="single" w:sz="8" w:space="0" w:color="000000"/>
+              <w:right w:val="single" w:sz="8" w:space="0" w:color="000000"/>
+            </w:tcBorders>
+            <w:vAlign w:val="center"/>
+          </w:tcPr>
+          <w:p>
+            <w:pPr>
+              <w:jc w:val="left"/>
               <w:rPr>
                 <w:sz w:val="24"/>
                 <w:szCs w:val="24"/>
@@ -7780,11 +7946,12 @@
       </w:tr>
       <w:tr>
         <w:trPr>
+          <w:cantSplit/>
           <w:jc w:val="center"/>
         </w:trPr>
         <w:tc>
           <w:tcPr>
-            <w:tcW w:w="3367" w:type="dxa"/>
+            <w:tcW w:w="4309" w:type="dxa"/>
             <w:tcBorders>
               <w:top w:val="single" w:sz="8" w:space="0" w:color="000000"/>
               <w:left w:val="single" w:sz="8" w:space="0" w:color="000000"/>
@@ -7812,7 +7979,7 @@
         </w:tc>
         <w:tc>
           <w:tcPr>
-            <w:tcW w:w="2248" w:type="dxa"/>
+            <w:tcW w:w="1927" w:type="dxa"/>
             <w:tcBorders>
               <w:top w:val="single" w:sz="8" w:space="0" w:color="000000"/>
               <w:left w:val="single" w:sz="8" w:space="0" w:color="000000"/>
@@ -7840,18 +8007,18 @@
         </w:tc>
         <w:tc>
           <w:tcPr>
-            <w:tcW w:w="3913" w:type="dxa"/>
-            <w:tcBorders>
-              <w:top w:val="single" w:sz="8" w:space="0" w:color="000000"/>
-              <w:left w:val="single" w:sz="8" w:space="0" w:color="000000"/>
-              <w:bottom w:val="single" w:sz="8" w:space="0" w:color="000000"/>
-              <w:right w:val="single" w:sz="8" w:space="0" w:color="000000"/>
-            </w:tcBorders>
-            <w:vAlign w:val="center"/>
-          </w:tcPr>
-          <w:p>
-            <w:pPr>
-              <w:jc w:val="both"/>
+            <w:tcW w:w="2835" w:type="dxa"/>
+            <w:tcBorders>
+              <w:top w:val="single" w:sz="8" w:space="0" w:color="000000"/>
+              <w:left w:val="single" w:sz="8" w:space="0" w:color="000000"/>
+              <w:bottom w:val="single" w:sz="8" w:space="0" w:color="000000"/>
+              <w:right w:val="single" w:sz="8" w:space="0" w:color="000000"/>
+            </w:tcBorders>
+            <w:vAlign w:val="center"/>
+          </w:tcPr>
+          <w:p>
+            <w:pPr>
+              <w:jc w:val="left"/>
               <w:rPr>
                 <w:sz w:val="24"/>
                 <w:szCs w:val="24"/>
@@ -7870,39 +8037,40 @@
       </w:tr>
       <w:tr>
         <w:trPr>
+          <w:cantSplit/>
           <w:jc w:val="center"/>
         </w:trPr>
         <w:tc>
           <w:tcPr>
-            <w:tcW w:w="3367" w:type="dxa"/>
-            <w:tcBorders>
-              <w:top w:val="single" w:sz="8" w:space="0" w:color="000000"/>
-              <w:left w:val="single" w:sz="8" w:space="0" w:color="000000"/>
-              <w:bottom w:val="single" w:sz="8" w:space="0" w:color="000000"/>
-              <w:right w:val="single" w:sz="8" w:space="0" w:color="000000"/>
-            </w:tcBorders>
-            <w:vAlign w:val="center"/>
-          </w:tcPr>
-          <w:p>
-            <w:pPr>
-              <w:rPr>
-                <w:sz w:val="24"/>
-                <w:szCs w:val="24"/>
-              </w:rPr>
-            </w:pPr>
-            <w:r>
-              <w:rPr>
-                <w:b w:val="0"/>
-                <w:sz w:val="24"/>
-                <w:szCs w:val="24"/>
-              </w:rPr>
-              <w:t>4. Ajukan permintaan review ke Legal &amp; Compliance bila permintaan menyangkut klausul atau komitmen kontrak (SNX-LEG-SOP-02 butir 6.1).</w:t>
-            </w:r>
-          </w:p>
-        </w:tc>
-        <w:tc>
-          <w:tcPr>
-            <w:tcW w:w="2248" w:type="dxa"/>
+            <w:tcW w:w="4309" w:type="dxa"/>
+            <w:tcBorders>
+              <w:top w:val="single" w:sz="8" w:space="0" w:color="000000"/>
+              <w:left w:val="single" w:sz="8" w:space="0" w:color="000000"/>
+              <w:bottom w:val="single" w:sz="8" w:space="0" w:color="000000"/>
+              <w:right w:val="single" w:sz="8" w:space="0" w:color="000000"/>
+            </w:tcBorders>
+            <w:vAlign w:val="center"/>
+          </w:tcPr>
+          <w:p>
+            <w:pPr>
+              <w:rPr>
+                <w:sz w:val="24"/>
+                <w:szCs w:val="24"/>
+              </w:rPr>
+            </w:pPr>
+            <w:r>
+              <w:rPr>
+                <w:b w:val="0"/>
+                <w:sz w:val="24"/>
+                <w:szCs w:val="24"/>
+              </w:rPr>
+              <w:t>4. Ajukan permintaan review ke Legal &amp; Compliance jika permintaan menyangkut klausul atau komitmen kontrak (SNX-LEG-SOP-02 butir 6.1).</w:t>
+            </w:r>
+          </w:p>
+        </w:tc>
+        <w:tc>
+          <w:tcPr>
+            <w:tcW w:w="1927" w:type="dxa"/>
             <w:tcBorders>
               <w:top w:val="single" w:sz="8" w:space="0" w:color="000000"/>
               <w:left w:val="single" w:sz="8" w:space="0" w:color="000000"/>
@@ -7930,18 +8098,18 @@
         </w:tc>
         <w:tc>
           <w:tcPr>
-            <w:tcW w:w="3913" w:type="dxa"/>
-            <w:tcBorders>
-              <w:top w:val="single" w:sz="8" w:space="0" w:color="000000"/>
-              <w:left w:val="single" w:sz="8" w:space="0" w:color="000000"/>
-              <w:bottom w:val="single" w:sz="8" w:space="0" w:color="000000"/>
-              <w:right w:val="single" w:sz="8" w:space="0" w:color="000000"/>
-            </w:tcBorders>
-            <w:vAlign w:val="center"/>
-          </w:tcPr>
-          <w:p>
-            <w:pPr>
-              <w:jc w:val="both"/>
+            <w:tcW w:w="2835" w:type="dxa"/>
+            <w:tcBorders>
+              <w:top w:val="single" w:sz="8" w:space="0" w:color="000000"/>
+              <w:left w:val="single" w:sz="8" w:space="0" w:color="000000"/>
+              <w:bottom w:val="single" w:sz="8" w:space="0" w:color="000000"/>
+              <w:right w:val="single" w:sz="8" w:space="0" w:color="000000"/>
+            </w:tcBorders>
+            <w:vAlign w:val="center"/>
+          </w:tcPr>
+          <w:p>
+            <w:pPr>
+              <w:jc w:val="left"/>
               <w:rPr>
                 <w:sz w:val="24"/>
                 <w:szCs w:val="24"/>
@@ -7960,11 +8128,12 @@
       </w:tr>
       <w:tr>
         <w:trPr>
+          <w:cantSplit/>
           <w:jc w:val="center"/>
         </w:trPr>
         <w:tc>
           <w:tcPr>
-            <w:tcW w:w="3367" w:type="dxa"/>
+            <w:tcW w:w="4309" w:type="dxa"/>
             <w:tcBorders>
               <w:top w:val="single" w:sz="8" w:space="0" w:color="000000"/>
               <w:left w:val="single" w:sz="8" w:space="0" w:color="000000"/>
@@ -7992,7 +8161,7 @@
         </w:tc>
         <w:tc>
           <w:tcPr>
-            <w:tcW w:w="2248" w:type="dxa"/>
+            <w:tcW w:w="1927" w:type="dxa"/>
             <w:tcBorders>
               <w:top w:val="single" w:sz="8" w:space="0" w:color="000000"/>
               <w:left w:val="single" w:sz="8" w:space="0" w:color="000000"/>
@@ -8020,18 +8189,18 @@
         </w:tc>
         <w:tc>
           <w:tcPr>
-            <w:tcW w:w="3913" w:type="dxa"/>
-            <w:tcBorders>
-              <w:top w:val="single" w:sz="8" w:space="0" w:color="000000"/>
-              <w:left w:val="single" w:sz="8" w:space="0" w:color="000000"/>
-              <w:bottom w:val="single" w:sz="8" w:space="0" w:color="000000"/>
-              <w:right w:val="single" w:sz="8" w:space="0" w:color="000000"/>
-            </w:tcBorders>
-            <w:vAlign w:val="center"/>
-          </w:tcPr>
-          <w:p>
-            <w:pPr>
-              <w:jc w:val="both"/>
+            <w:tcW w:w="2835" w:type="dxa"/>
+            <w:tcBorders>
+              <w:top w:val="single" w:sz="8" w:space="0" w:color="000000"/>
+              <w:left w:val="single" w:sz="8" w:space="0" w:color="000000"/>
+              <w:bottom w:val="single" w:sz="8" w:space="0" w:color="000000"/>
+              <w:right w:val="single" w:sz="8" w:space="0" w:color="000000"/>
+            </w:tcBorders>
+            <w:vAlign w:val="center"/>
+          </w:tcPr>
+          <w:p>
+            <w:pPr>
+              <w:jc w:val="left"/>
               <w:rPr>
                 <w:sz w:val="24"/>
                 <w:szCs w:val="24"/>
@@ -8050,39 +8219,40 @@
       </w:tr>
       <w:tr>
         <w:trPr>
+          <w:cantSplit/>
           <w:jc w:val="center"/>
         </w:trPr>
         <w:tc>
           <w:tcPr>
-            <w:tcW w:w="3367" w:type="dxa"/>
-            <w:tcBorders>
-              <w:top w:val="single" w:sz="8" w:space="0" w:color="000000"/>
-              <w:left w:val="single" w:sz="8" w:space="0" w:color="000000"/>
-              <w:bottom w:val="single" w:sz="8" w:space="0" w:color="000000"/>
-              <w:right w:val="single" w:sz="8" w:space="0" w:color="000000"/>
-            </w:tcBorders>
-            <w:vAlign w:val="center"/>
-          </w:tcPr>
-          <w:p>
-            <w:pPr>
-              <w:rPr>
-                <w:sz w:val="24"/>
-                <w:szCs w:val="24"/>
-              </w:rPr>
-            </w:pPr>
-            <w:r>
-              <w:rPr>
-                <w:b w:val="0"/>
-                <w:sz w:val="24"/>
-                <w:szCs w:val="24"/>
-              </w:rPr>
-              <w:t>6. Ulangi review scope bila permintaan mengubah scope atau timeline, dan validasi harga dan margin bila harga ikut berubah (butir 6.2 dan 6.3).</w:t>
-            </w:r>
-          </w:p>
-        </w:tc>
-        <w:tc>
-          <w:tcPr>
-            <w:tcW w:w="2248" w:type="dxa"/>
+            <w:tcW w:w="4309" w:type="dxa"/>
+            <w:tcBorders>
+              <w:top w:val="single" w:sz="8" w:space="0" w:color="000000"/>
+              <w:left w:val="single" w:sz="8" w:space="0" w:color="000000"/>
+              <w:bottom w:val="single" w:sz="8" w:space="0" w:color="000000"/>
+              <w:right w:val="single" w:sz="8" w:space="0" w:color="000000"/>
+            </w:tcBorders>
+            <w:vAlign w:val="center"/>
+          </w:tcPr>
+          <w:p>
+            <w:pPr>
+              <w:rPr>
+                <w:sz w:val="24"/>
+                <w:szCs w:val="24"/>
+              </w:rPr>
+            </w:pPr>
+            <w:r>
+              <w:rPr>
+                <w:b w:val="0"/>
+                <w:sz w:val="24"/>
+                <w:szCs w:val="24"/>
+              </w:rPr>
+              <w:t>6. Ulangi review scope jika permintaan mengubah scope atau timeline, dan ulangi validasi harga dan margin jika harga ikut berubah (butir 6.2 dan 6.3).</w:t>
+            </w:r>
+          </w:p>
+        </w:tc>
+        <w:tc>
+          <w:tcPr>
+            <w:tcW w:w="1927" w:type="dxa"/>
             <w:tcBorders>
               <w:top w:val="single" w:sz="8" w:space="0" w:color="000000"/>
               <w:left w:val="single" w:sz="8" w:space="0" w:color="000000"/>
@@ -8110,18 +8280,18 @@
         </w:tc>
         <w:tc>
           <w:tcPr>
-            <w:tcW w:w="3913" w:type="dxa"/>
-            <w:tcBorders>
-              <w:top w:val="single" w:sz="8" w:space="0" w:color="000000"/>
-              <w:left w:val="single" w:sz="8" w:space="0" w:color="000000"/>
-              <w:bottom w:val="single" w:sz="8" w:space="0" w:color="000000"/>
-              <w:right w:val="single" w:sz="8" w:space="0" w:color="000000"/>
-            </w:tcBorders>
-            <w:vAlign w:val="center"/>
-          </w:tcPr>
-          <w:p>
-            <w:pPr>
-              <w:jc w:val="both"/>
+            <w:tcW w:w="2835" w:type="dxa"/>
+            <w:tcBorders>
+              <w:top w:val="single" w:sz="8" w:space="0" w:color="000000"/>
+              <w:left w:val="single" w:sz="8" w:space="0" w:color="000000"/>
+              <w:bottom w:val="single" w:sz="8" w:space="0" w:color="000000"/>
+              <w:right w:val="single" w:sz="8" w:space="0" w:color="000000"/>
+            </w:tcBorders>
+            <w:vAlign w:val="center"/>
+          </w:tcPr>
+          <w:p>
+            <w:pPr>
+              <w:jc w:val="left"/>
               <w:rPr>
                 <w:sz w:val="24"/>
                 <w:szCs w:val="24"/>
@@ -8140,11 +8310,12 @@
       </w:tr>
       <w:tr>
         <w:trPr>
+          <w:cantSplit/>
           <w:jc w:val="center"/>
         </w:trPr>
         <w:tc>
           <w:tcPr>
-            <w:tcW w:w="3367" w:type="dxa"/>
+            <w:tcW w:w="4309" w:type="dxa"/>
             <w:tcBorders>
               <w:top w:val="single" w:sz="8" w:space="0" w:color="000000"/>
               <w:left w:val="single" w:sz="8" w:space="0" w:color="000000"/>
@@ -8172,7 +8343,7 @@
         </w:tc>
         <w:tc>
           <w:tcPr>
-            <w:tcW w:w="2248" w:type="dxa"/>
+            <w:tcW w:w="1927" w:type="dxa"/>
             <w:tcBorders>
               <w:top w:val="single" w:sz="8" w:space="0" w:color="000000"/>
               <w:left w:val="single" w:sz="8" w:space="0" w:color="000000"/>
@@ -8200,18 +8371,18 @@
         </w:tc>
         <w:tc>
           <w:tcPr>
-            <w:tcW w:w="3913" w:type="dxa"/>
-            <w:tcBorders>
-              <w:top w:val="single" w:sz="8" w:space="0" w:color="000000"/>
-              <w:left w:val="single" w:sz="8" w:space="0" w:color="000000"/>
-              <w:bottom w:val="single" w:sz="8" w:space="0" w:color="000000"/>
-              <w:right w:val="single" w:sz="8" w:space="0" w:color="000000"/>
-            </w:tcBorders>
-            <w:vAlign w:val="center"/>
-          </w:tcPr>
-          <w:p>
-            <w:pPr>
-              <w:jc w:val="both"/>
+            <w:tcW w:w="2835" w:type="dxa"/>
+            <w:tcBorders>
+              <w:top w:val="single" w:sz="8" w:space="0" w:color="000000"/>
+              <w:left w:val="single" w:sz="8" w:space="0" w:color="000000"/>
+              <w:bottom w:val="single" w:sz="8" w:space="0" w:color="000000"/>
+              <w:right w:val="single" w:sz="8" w:space="0" w:color="000000"/>
+            </w:tcBorders>
+            <w:vAlign w:val="center"/>
+          </w:tcPr>
+          <w:p>
+            <w:pPr>
+              <w:jc w:val="left"/>
               <w:rPr>
                 <w:sz w:val="24"/>
                 <w:szCs w:val="24"/>
@@ -8230,11 +8401,12 @@
       </w:tr>
       <w:tr>
         <w:trPr>
+          <w:cantSplit/>
           <w:jc w:val="center"/>
         </w:trPr>
         <w:tc>
           <w:tcPr>
-            <w:tcW w:w="3367" w:type="dxa"/>
+            <w:tcW w:w="4309" w:type="dxa"/>
             <w:tcBorders>
               <w:top w:val="single" w:sz="8" w:space="0" w:color="000000"/>
               <w:left w:val="single" w:sz="8" w:space="0" w:color="000000"/>
@@ -8262,7 +8434,7 @@
         </w:tc>
         <w:tc>
           <w:tcPr>
-            <w:tcW w:w="2248" w:type="dxa"/>
+            <w:tcW w:w="1927" w:type="dxa"/>
             <w:tcBorders>
               <w:top w:val="single" w:sz="8" w:space="0" w:color="000000"/>
               <w:left w:val="single" w:sz="8" w:space="0" w:color="000000"/>
@@ -8290,18 +8462,18 @@
         </w:tc>
         <w:tc>
           <w:tcPr>
-            <w:tcW w:w="3913" w:type="dxa"/>
-            <w:tcBorders>
-              <w:top w:val="single" w:sz="8" w:space="0" w:color="000000"/>
-              <w:left w:val="single" w:sz="8" w:space="0" w:color="000000"/>
-              <w:bottom w:val="single" w:sz="8" w:space="0" w:color="000000"/>
-              <w:right w:val="single" w:sz="8" w:space="0" w:color="000000"/>
-            </w:tcBorders>
-            <w:vAlign w:val="center"/>
-          </w:tcPr>
-          <w:p>
-            <w:pPr>
-              <w:jc w:val="both"/>
+            <w:tcW w:w="2835" w:type="dxa"/>
+            <w:tcBorders>
+              <w:top w:val="single" w:sz="8" w:space="0" w:color="000000"/>
+              <w:left w:val="single" w:sz="8" w:space="0" w:color="000000"/>
+              <w:bottom w:val="single" w:sz="8" w:space="0" w:color="000000"/>
+              <w:right w:val="single" w:sz="8" w:space="0" w:color="000000"/>
+            </w:tcBorders>
+            <w:vAlign w:val="center"/>
+          </w:tcPr>
+          <w:p>
+            <w:pPr>
+              <w:jc w:val="left"/>
               <w:rPr>
                 <w:sz w:val="24"/>
                 <w:szCs w:val="24"/>
@@ -8320,11 +8492,12 @@
       </w:tr>
       <w:tr>
         <w:trPr>
+          <w:cantSplit/>
           <w:jc w:val="center"/>
         </w:trPr>
         <w:tc>
           <w:tcPr>
-            <w:tcW w:w="3367" w:type="dxa"/>
+            <w:tcW w:w="4309" w:type="dxa"/>
             <w:tcBorders>
               <w:top w:val="single" w:sz="8" w:space="0" w:color="000000"/>
               <w:left w:val="single" w:sz="8" w:space="0" w:color="000000"/>
@@ -8352,7 +8525,7 @@
         </w:tc>
         <w:tc>
           <w:tcPr>
-            <w:tcW w:w="2248" w:type="dxa"/>
+            <w:tcW w:w="1927" w:type="dxa"/>
             <w:tcBorders>
               <w:top w:val="single" w:sz="8" w:space="0" w:color="000000"/>
               <w:left w:val="single" w:sz="8" w:space="0" w:color="000000"/>
@@ -8380,18 +8553,18 @@
         </w:tc>
         <w:tc>
           <w:tcPr>
-            <w:tcW w:w="3913" w:type="dxa"/>
-            <w:tcBorders>
-              <w:top w:val="single" w:sz="8" w:space="0" w:color="000000"/>
-              <w:left w:val="single" w:sz="8" w:space="0" w:color="000000"/>
-              <w:bottom w:val="single" w:sz="8" w:space="0" w:color="000000"/>
-              <w:right w:val="single" w:sz="8" w:space="0" w:color="000000"/>
-            </w:tcBorders>
-            <w:vAlign w:val="center"/>
-          </w:tcPr>
-          <w:p>
-            <w:pPr>
-              <w:jc w:val="both"/>
+            <w:tcW w:w="2835" w:type="dxa"/>
+            <w:tcBorders>
+              <w:top w:val="single" w:sz="8" w:space="0" w:color="000000"/>
+              <w:left w:val="single" w:sz="8" w:space="0" w:color="000000"/>
+              <w:bottom w:val="single" w:sz="8" w:space="0" w:color="000000"/>
+              <w:right w:val="single" w:sz="8" w:space="0" w:color="000000"/>
+            </w:tcBorders>
+            <w:vAlign w:val="center"/>
+          </w:tcPr>
+          <w:p>
+            <w:pPr>
+              <w:jc w:val="left"/>
               <w:rPr>
                 <w:sz w:val="24"/>
                 <w:szCs w:val="24"/>
@@ -8410,11 +8583,12 @@
       </w:tr>
       <w:tr>
         <w:trPr>
+          <w:cantSplit/>
           <w:jc w:val="center"/>
         </w:trPr>
         <w:tc>
           <w:tcPr>
-            <w:tcW w:w="3367" w:type="dxa"/>
+            <w:tcW w:w="4309" w:type="dxa"/>
             <w:tcBorders>
               <w:top w:val="single" w:sz="8" w:space="0" w:color="000000"/>
               <w:left w:val="single" w:sz="8" w:space="0" w:color="000000"/>
@@ -8442,7 +8616,7 @@
         </w:tc>
         <w:tc>
           <w:tcPr>
-            <w:tcW w:w="2248" w:type="dxa"/>
+            <w:tcW w:w="1927" w:type="dxa"/>
             <w:tcBorders>
               <w:top w:val="single" w:sz="8" w:space="0" w:color="000000"/>
               <w:left w:val="single" w:sz="8" w:space="0" w:color="000000"/>
@@ -8470,18 +8644,18 @@
         </w:tc>
         <w:tc>
           <w:tcPr>
-            <w:tcW w:w="3913" w:type="dxa"/>
-            <w:tcBorders>
-              <w:top w:val="single" w:sz="8" w:space="0" w:color="000000"/>
-              <w:left w:val="single" w:sz="8" w:space="0" w:color="000000"/>
-              <w:bottom w:val="single" w:sz="8" w:space="0" w:color="000000"/>
-              <w:right w:val="single" w:sz="8" w:space="0" w:color="000000"/>
-            </w:tcBorders>
-            <w:vAlign w:val="center"/>
-          </w:tcPr>
-          <w:p>
-            <w:pPr>
-              <w:jc w:val="both"/>
+            <w:tcW w:w="2835" w:type="dxa"/>
+            <w:tcBorders>
+              <w:top w:val="single" w:sz="8" w:space="0" w:color="000000"/>
+              <w:left w:val="single" w:sz="8" w:space="0" w:color="000000"/>
+              <w:bottom w:val="single" w:sz="8" w:space="0" w:color="000000"/>
+              <w:right w:val="single" w:sz="8" w:space="0" w:color="000000"/>
+            </w:tcBorders>
+            <w:vAlign w:val="center"/>
+          </w:tcPr>
+          <w:p>
+            <w:pPr>
+              <w:jc w:val="left"/>
               <w:rPr>
                 <w:sz w:val="24"/>
                 <w:szCs w:val="24"/>
@@ -8538,6 +8712,7 @@
     </w:p>
     <w:p>
       <w:pPr>
+        <w:keepNext/>
         <w:pBdr>
           <w:top w:val="nil"/>
           <w:left w:val="nil"/>
@@ -8557,7 +8732,7 @@
           <w:sz w:val="24"/>
           <w:szCs w:val="24"/>
         </w:rPr>
-        <w:t xml:space="preserve">Urutan otorisasi dan syarat pengiriman ada di butir 4.8.</w:t>
+        <w:t xml:space="preserve">Urutan otorisasi dan syarat pengiriman mengikuti butir 4.8.</w:t>
       </w:r>
     </w:p>
     <w:tbl>
@@ -8570,27 +8745,30 @@
         <w:tblLook w:val="0400" w:firstRow="0" w:lastRow="0" w:firstColumn="0" w:lastColumn="0" w:noHBand="0" w:noVBand="1"/>
       </w:tblPr>
       <w:tblGrid>
-        <w:gridCol w:w="3367"/>
-        <w:gridCol w:w="2248"/>
-        <w:gridCol w:w="3913"/>
+        <w:gridCol w:w="4309"/>
+        <w:gridCol w:w="1927"/>
+        <w:gridCol w:w="2835"/>
       </w:tblGrid>
       <w:tr>
         <w:trPr>
+          <w:cantSplit/>
+          <w:tblHeader/>
           <w:jc w:val="center"/>
         </w:trPr>
         <w:tc>
           <w:tcPr>
-            <w:tcW w:w="3367" w:type="dxa"/>
-            <w:tcBorders>
-              <w:top w:val="single" w:sz="8" w:space="0" w:color="000000"/>
-              <w:left w:val="single" w:sz="8" w:space="0" w:color="000000"/>
-              <w:bottom w:val="single" w:sz="8" w:space="0" w:color="000000"/>
-              <w:right w:val="single" w:sz="8" w:space="0" w:color="000000"/>
-            </w:tcBorders>
-            <w:vAlign w:val="center"/>
-          </w:tcPr>
-          <w:p>
-            <w:pPr>
+            <w:tcW w:w="4309" w:type="dxa"/>
+            <w:tcBorders>
+              <w:top w:val="single" w:sz="8" w:space="0" w:color="000000"/>
+              <w:left w:val="single" w:sz="8" w:space="0" w:color="000000"/>
+              <w:bottom w:val="single" w:sz="8" w:space="0" w:color="000000"/>
+              <w:right w:val="single" w:sz="8" w:space="0" w:color="000000"/>
+            </w:tcBorders>
+            <w:vAlign w:val="center"/>
+          </w:tcPr>
+          <w:p>
+            <w:pPr>
+              <w:keepNext/>
               <w:jc w:val="center"/>
               <w:rPr>
                 <w:sz w:val="24"/>
@@ -8610,17 +8788,18 @@
         </w:tc>
         <w:tc>
           <w:tcPr>
-            <w:tcW w:w="2248" w:type="dxa"/>
-            <w:tcBorders>
-              <w:top w:val="single" w:sz="8" w:space="0" w:color="000000"/>
-              <w:left w:val="single" w:sz="8" w:space="0" w:color="000000"/>
-              <w:bottom w:val="single" w:sz="8" w:space="0" w:color="000000"/>
-              <w:right w:val="single" w:sz="8" w:space="0" w:color="000000"/>
-            </w:tcBorders>
-            <w:vAlign w:val="center"/>
-          </w:tcPr>
-          <w:p>
-            <w:pPr>
+            <w:tcW w:w="1927" w:type="dxa"/>
+            <w:tcBorders>
+              <w:top w:val="single" w:sz="8" w:space="0" w:color="000000"/>
+              <w:left w:val="single" w:sz="8" w:space="0" w:color="000000"/>
+              <w:bottom w:val="single" w:sz="8" w:space="0" w:color="000000"/>
+              <w:right w:val="single" w:sz="8" w:space="0" w:color="000000"/>
+            </w:tcBorders>
+            <w:vAlign w:val="center"/>
+          </w:tcPr>
+          <w:p>
+            <w:pPr>
+              <w:keepNext/>
               <w:jc w:val="center"/>
               <w:rPr>
                 <w:sz w:val="24"/>
@@ -8640,17 +8819,18 @@
         </w:tc>
         <w:tc>
           <w:tcPr>
-            <w:tcW w:w="3913" w:type="dxa"/>
-            <w:tcBorders>
-              <w:top w:val="single" w:sz="8" w:space="0" w:color="000000"/>
-              <w:left w:val="single" w:sz="8" w:space="0" w:color="000000"/>
-              <w:bottom w:val="single" w:sz="8" w:space="0" w:color="000000"/>
-              <w:right w:val="single" w:sz="8" w:space="0" w:color="000000"/>
-            </w:tcBorders>
-            <w:vAlign w:val="center"/>
-          </w:tcPr>
-          <w:p>
-            <w:pPr>
+            <w:tcW w:w="2835" w:type="dxa"/>
+            <w:tcBorders>
+              <w:top w:val="single" w:sz="8" w:space="0" w:color="000000"/>
+              <w:left w:val="single" w:sz="8" w:space="0" w:color="000000"/>
+              <w:bottom w:val="single" w:sz="8" w:space="0" w:color="000000"/>
+              <w:right w:val="single" w:sz="8" w:space="0" w:color="000000"/>
+            </w:tcBorders>
+            <w:vAlign w:val="center"/>
+          </w:tcPr>
+          <w:p>
+            <w:pPr>
+              <w:keepNext/>
               <w:jc w:val="center"/>
               <w:rPr>
                 <w:sz w:val="24"/>
@@ -8671,39 +8851,40 @@
       </w:tr>
       <w:tr>
         <w:trPr>
+          <w:cantSplit/>
           <w:jc w:val="center"/>
         </w:trPr>
         <w:tc>
           <w:tcPr>
-            <w:tcW w:w="3367" w:type="dxa"/>
-            <w:tcBorders>
-              <w:top w:val="single" w:sz="8" w:space="0" w:color="000000"/>
-              <w:left w:val="single" w:sz="8" w:space="0" w:color="000000"/>
-              <w:bottom w:val="single" w:sz="8" w:space="0" w:color="000000"/>
-              <w:right w:val="single" w:sz="8" w:space="0" w:color="000000"/>
-            </w:tcBorders>
-            <w:vAlign w:val="center"/>
-          </w:tcPr>
-          <w:p>
-            <w:pPr>
-              <w:rPr>
-                <w:sz w:val="24"/>
-                <w:szCs w:val="24"/>
-              </w:rPr>
-            </w:pPr>
-            <w:r>
-              <w:rPr>
-                <w:b w:val="0"/>
-                <w:sz w:val="24"/>
-                <w:szCs w:val="24"/>
-              </w:rPr>
-              <w:t>1. Review internal atas proposal, quotation, Catatan review scope, serta margin dan diskon di lembar harga dan margin.</w:t>
-            </w:r>
-          </w:p>
-        </w:tc>
-        <w:tc>
-          <w:tcPr>
-            <w:tcW w:w="2248" w:type="dxa"/>
+            <w:tcW w:w="4309" w:type="dxa"/>
+            <w:tcBorders>
+              <w:top w:val="single" w:sz="8" w:space="0" w:color="000000"/>
+              <w:left w:val="single" w:sz="8" w:space="0" w:color="000000"/>
+              <w:bottom w:val="single" w:sz="8" w:space="0" w:color="000000"/>
+              <w:right w:val="single" w:sz="8" w:space="0" w:color="000000"/>
+            </w:tcBorders>
+            <w:vAlign w:val="center"/>
+          </w:tcPr>
+          <w:p>
+            <w:pPr>
+              <w:rPr>
+                <w:sz w:val="24"/>
+                <w:szCs w:val="24"/>
+              </w:rPr>
+            </w:pPr>
+            <w:r>
+              <w:rPr>
+                <w:b w:val="0"/>
+                <w:sz w:val="24"/>
+                <w:szCs w:val="24"/>
+              </w:rPr>
+              <w:t>1. Lakukan review internal atas proposal, quotation, Catatan review scope, serta margin dan diskon di lembar harga dan margin.</w:t>
+            </w:r>
+          </w:p>
+        </w:tc>
+        <w:tc>
+          <w:tcPr>
+            <w:tcW w:w="1927" w:type="dxa"/>
             <w:tcBorders>
               <w:top w:val="single" w:sz="8" w:space="0" w:color="000000"/>
               <w:left w:val="single" w:sz="8" w:space="0" w:color="000000"/>
@@ -8731,18 +8912,18 @@
         </w:tc>
         <w:tc>
           <w:tcPr>
-            <w:tcW w:w="3913" w:type="dxa"/>
-            <w:tcBorders>
-              <w:top w:val="single" w:sz="8" w:space="0" w:color="000000"/>
-              <w:left w:val="single" w:sz="8" w:space="0" w:color="000000"/>
-              <w:bottom w:val="single" w:sz="8" w:space="0" w:color="000000"/>
-              <w:right w:val="single" w:sz="8" w:space="0" w:color="000000"/>
-            </w:tcBorders>
-            <w:vAlign w:val="center"/>
-          </w:tcPr>
-          <w:p>
-            <w:pPr>
-              <w:jc w:val="both"/>
+            <w:tcW w:w="2835" w:type="dxa"/>
+            <w:tcBorders>
+              <w:top w:val="single" w:sz="8" w:space="0" w:color="000000"/>
+              <w:left w:val="single" w:sz="8" w:space="0" w:color="000000"/>
+              <w:bottom w:val="single" w:sz="8" w:space="0" w:color="000000"/>
+              <w:right w:val="single" w:sz="8" w:space="0" w:color="000000"/>
+            </w:tcBorders>
+            <w:vAlign w:val="center"/>
+          </w:tcPr>
+          <w:p>
+            <w:pPr>
+              <w:jc w:val="left"/>
               <w:rPr>
                 <w:sz w:val="24"/>
                 <w:szCs w:val="24"/>
@@ -8761,11 +8942,12 @@
       </w:tr>
       <w:tr>
         <w:trPr>
+          <w:cantSplit/>
           <w:jc w:val="center"/>
         </w:trPr>
         <w:tc>
           <w:tcPr>
-            <w:tcW w:w="3367" w:type="dxa"/>
+            <w:tcW w:w="4309" w:type="dxa"/>
             <w:tcBorders>
               <w:top w:val="single" w:sz="8" w:space="0" w:color="000000"/>
               <w:left w:val="single" w:sz="8" w:space="0" w:color="000000"/>
@@ -8793,7 +8975,7 @@
         </w:tc>
         <w:tc>
           <w:tcPr>
-            <w:tcW w:w="2248" w:type="dxa"/>
+            <w:tcW w:w="1927" w:type="dxa"/>
             <w:tcBorders>
               <w:top w:val="single" w:sz="8" w:space="0" w:color="000000"/>
               <w:left w:val="single" w:sz="8" w:space="0" w:color="000000"/>
@@ -8821,18 +9003,18 @@
         </w:tc>
         <w:tc>
           <w:tcPr>
-            <w:tcW w:w="3913" w:type="dxa"/>
-            <w:tcBorders>
-              <w:top w:val="single" w:sz="8" w:space="0" w:color="000000"/>
-              <w:left w:val="single" w:sz="8" w:space="0" w:color="000000"/>
-              <w:bottom w:val="single" w:sz="8" w:space="0" w:color="000000"/>
-              <w:right w:val="single" w:sz="8" w:space="0" w:color="000000"/>
-            </w:tcBorders>
-            <w:vAlign w:val="center"/>
-          </w:tcPr>
-          <w:p>
-            <w:pPr>
-              <w:jc w:val="both"/>
+            <w:tcW w:w="2835" w:type="dxa"/>
+            <w:tcBorders>
+              <w:top w:val="single" w:sz="8" w:space="0" w:color="000000"/>
+              <w:left w:val="single" w:sz="8" w:space="0" w:color="000000"/>
+              <w:bottom w:val="single" w:sz="8" w:space="0" w:color="000000"/>
+              <w:right w:val="single" w:sz="8" w:space="0" w:color="000000"/>
+            </w:tcBorders>
+            <w:vAlign w:val="center"/>
+          </w:tcPr>
+          <w:p>
+            <w:pPr>
+              <w:jc w:val="left"/>
               <w:rPr>
                 <w:sz w:val="24"/>
                 <w:szCs w:val="24"/>
@@ -8851,11 +9033,12 @@
       </w:tr>
       <w:tr>
         <w:trPr>
+          <w:cantSplit/>
           <w:jc w:val="center"/>
         </w:trPr>
         <w:tc>
           <w:tcPr>
-            <w:tcW w:w="3367" w:type="dxa"/>
+            <w:tcW w:w="4309" w:type="dxa"/>
             <w:tcBorders>
               <w:top w:val="single" w:sz="8" w:space="0" w:color="000000"/>
               <w:left w:val="single" w:sz="8" w:space="0" w:color="000000"/>
@@ -8883,7 +9066,7 @@
         </w:tc>
         <w:tc>
           <w:tcPr>
-            <w:tcW w:w="2248" w:type="dxa"/>
+            <w:tcW w:w="1927" w:type="dxa"/>
             <w:tcBorders>
               <w:top w:val="single" w:sz="8" w:space="0" w:color="000000"/>
               <w:left w:val="single" w:sz="8" w:space="0" w:color="000000"/>
@@ -8911,18 +9094,18 @@
         </w:tc>
         <w:tc>
           <w:tcPr>
-            <w:tcW w:w="3913" w:type="dxa"/>
-            <w:tcBorders>
-              <w:top w:val="single" w:sz="8" w:space="0" w:color="000000"/>
-              <w:left w:val="single" w:sz="8" w:space="0" w:color="000000"/>
-              <w:bottom w:val="single" w:sz="8" w:space="0" w:color="000000"/>
-              <w:right w:val="single" w:sz="8" w:space="0" w:color="000000"/>
-            </w:tcBorders>
-            <w:vAlign w:val="center"/>
-          </w:tcPr>
-          <w:p>
-            <w:pPr>
-              <w:jc w:val="both"/>
+            <w:tcW w:w="2835" w:type="dxa"/>
+            <w:tcBorders>
+              <w:top w:val="single" w:sz="8" w:space="0" w:color="000000"/>
+              <w:left w:val="single" w:sz="8" w:space="0" w:color="000000"/>
+              <w:bottom w:val="single" w:sz="8" w:space="0" w:color="000000"/>
+              <w:right w:val="single" w:sz="8" w:space="0" w:color="000000"/>
+            </w:tcBorders>
+            <w:vAlign w:val="center"/>
+          </w:tcPr>
+          <w:p>
+            <w:pPr>
+              <w:jc w:val="left"/>
               <w:rPr>
                 <w:sz w:val="24"/>
                 <w:szCs w:val="24"/>
@@ -8941,11 +9124,12 @@
       </w:tr>
       <w:tr>
         <w:trPr>
+          <w:cantSplit/>
           <w:jc w:val="center"/>
         </w:trPr>
         <w:tc>
           <w:tcPr>
-            <w:tcW w:w="3367" w:type="dxa"/>
+            <w:tcW w:w="4309" w:type="dxa"/>
             <w:tcBorders>
               <w:top w:val="single" w:sz="8" w:space="0" w:color="000000"/>
               <w:left w:val="single" w:sz="8" w:space="0" w:color="000000"/>
@@ -8973,7 +9157,7 @@
         </w:tc>
         <w:tc>
           <w:tcPr>
-            <w:tcW w:w="2248" w:type="dxa"/>
+            <w:tcW w:w="1927" w:type="dxa"/>
             <w:tcBorders>
               <w:top w:val="single" w:sz="8" w:space="0" w:color="000000"/>
               <w:left w:val="single" w:sz="8" w:space="0" w:color="000000"/>
@@ -9001,18 +9185,18 @@
         </w:tc>
         <w:tc>
           <w:tcPr>
-            <w:tcW w:w="3913" w:type="dxa"/>
-            <w:tcBorders>
-              <w:top w:val="single" w:sz="8" w:space="0" w:color="000000"/>
-              <w:left w:val="single" w:sz="8" w:space="0" w:color="000000"/>
-              <w:bottom w:val="single" w:sz="8" w:space="0" w:color="000000"/>
-              <w:right w:val="single" w:sz="8" w:space="0" w:color="000000"/>
-            </w:tcBorders>
-            <w:vAlign w:val="center"/>
-          </w:tcPr>
-          <w:p>
-            <w:pPr>
-              <w:jc w:val="both"/>
+            <w:tcW w:w="2835" w:type="dxa"/>
+            <w:tcBorders>
+              <w:top w:val="single" w:sz="8" w:space="0" w:color="000000"/>
+              <w:left w:val="single" w:sz="8" w:space="0" w:color="000000"/>
+              <w:bottom w:val="single" w:sz="8" w:space="0" w:color="000000"/>
+              <w:right w:val="single" w:sz="8" w:space="0" w:color="000000"/>
+            </w:tcBorders>
+            <w:vAlign w:val="center"/>
+          </w:tcPr>
+          <w:p>
+            <w:pPr>
+              <w:jc w:val="left"/>
               <w:rPr>
                 <w:sz w:val="24"/>
                 <w:szCs w:val="24"/>
@@ -9031,11 +9215,12 @@
       </w:tr>
       <w:tr>
         <w:trPr>
+          <w:cantSplit/>
           <w:jc w:val="center"/>
         </w:trPr>
         <w:tc>
           <w:tcPr>
-            <w:tcW w:w="3367" w:type="dxa"/>
+            <w:tcW w:w="4309" w:type="dxa"/>
             <w:tcBorders>
               <w:top w:val="single" w:sz="8" w:space="0" w:color="000000"/>
               <w:left w:val="single" w:sz="8" w:space="0" w:color="000000"/>
@@ -9063,7 +9248,7 @@
         </w:tc>
         <w:tc>
           <w:tcPr>
-            <w:tcW w:w="2248" w:type="dxa"/>
+            <w:tcW w:w="1927" w:type="dxa"/>
             <w:tcBorders>
               <w:top w:val="single" w:sz="8" w:space="0" w:color="000000"/>
               <w:left w:val="single" w:sz="8" w:space="0" w:color="000000"/>
@@ -9091,18 +9276,18 @@
         </w:tc>
         <w:tc>
           <w:tcPr>
-            <w:tcW w:w="3913" w:type="dxa"/>
-            <w:tcBorders>
-              <w:top w:val="single" w:sz="8" w:space="0" w:color="000000"/>
-              <w:left w:val="single" w:sz="8" w:space="0" w:color="000000"/>
-              <w:bottom w:val="single" w:sz="8" w:space="0" w:color="000000"/>
-              <w:right w:val="single" w:sz="8" w:space="0" w:color="000000"/>
-            </w:tcBorders>
-            <w:vAlign w:val="center"/>
-          </w:tcPr>
-          <w:p>
-            <w:pPr>
-              <w:jc w:val="both"/>
+            <w:tcW w:w="2835" w:type="dxa"/>
+            <w:tcBorders>
+              <w:top w:val="single" w:sz="8" w:space="0" w:color="000000"/>
+              <w:left w:val="single" w:sz="8" w:space="0" w:color="000000"/>
+              <w:bottom w:val="single" w:sz="8" w:space="0" w:color="000000"/>
+              <w:right w:val="single" w:sz="8" w:space="0" w:color="000000"/>
+            </w:tcBorders>
+            <w:vAlign w:val="center"/>
+          </w:tcPr>
+          <w:p>
+            <w:pPr>
+              <w:jc w:val="left"/>
               <w:rPr>
                 <w:sz w:val="24"/>
                 <w:szCs w:val="24"/>
@@ -9121,11 +9306,12 @@
       </w:tr>
       <w:tr>
         <w:trPr>
+          <w:cantSplit/>
           <w:jc w:val="center"/>
         </w:trPr>
         <w:tc>
           <w:tcPr>
-            <w:tcW w:w="3367" w:type="dxa"/>
+            <w:tcW w:w="4309" w:type="dxa"/>
             <w:tcBorders>
               <w:top w:val="single" w:sz="8" w:space="0" w:color="000000"/>
               <w:left w:val="single" w:sz="8" w:space="0" w:color="000000"/>
@@ -9153,7 +9339,7 @@
         </w:tc>
         <w:tc>
           <w:tcPr>
-            <w:tcW w:w="2248" w:type="dxa"/>
+            <w:tcW w:w="1927" w:type="dxa"/>
             <w:tcBorders>
               <w:top w:val="single" w:sz="8" w:space="0" w:color="000000"/>
               <w:left w:val="single" w:sz="8" w:space="0" w:color="000000"/>
@@ -9181,18 +9367,18 @@
         </w:tc>
         <w:tc>
           <w:tcPr>
-            <w:tcW w:w="3913" w:type="dxa"/>
-            <w:tcBorders>
-              <w:top w:val="single" w:sz="8" w:space="0" w:color="000000"/>
-              <w:left w:val="single" w:sz="8" w:space="0" w:color="000000"/>
-              <w:bottom w:val="single" w:sz="8" w:space="0" w:color="000000"/>
-              <w:right w:val="single" w:sz="8" w:space="0" w:color="000000"/>
-            </w:tcBorders>
-            <w:vAlign w:val="center"/>
-          </w:tcPr>
-          <w:p>
-            <w:pPr>
-              <w:jc w:val="both"/>
+            <w:tcW w:w="2835" w:type="dxa"/>
+            <w:tcBorders>
+              <w:top w:val="single" w:sz="8" w:space="0" w:color="000000"/>
+              <w:left w:val="single" w:sz="8" w:space="0" w:color="000000"/>
+              <w:bottom w:val="single" w:sz="8" w:space="0" w:color="000000"/>
+              <w:right w:val="single" w:sz="8" w:space="0" w:color="000000"/>
+            </w:tcBorders>
+            <w:vAlign w:val="center"/>
+          </w:tcPr>
+          <w:p>
+            <w:pPr>
+              <w:jc w:val="left"/>
               <w:rPr>
                 <w:sz w:val="24"/>
                 <w:szCs w:val="24"/>
@@ -9211,11 +9397,12 @@
       </w:tr>
       <w:tr>
         <w:trPr>
+          <w:cantSplit/>
           <w:jc w:val="center"/>
         </w:trPr>
         <w:tc>
           <w:tcPr>
-            <w:tcW w:w="3367" w:type="dxa"/>
+            <w:tcW w:w="4309" w:type="dxa"/>
             <w:tcBorders>
               <w:top w:val="single" w:sz="8" w:space="0" w:color="000000"/>
               <w:left w:val="single" w:sz="8" w:space="0" w:color="000000"/>
@@ -9243,7 +9430,7 @@
         </w:tc>
         <w:tc>
           <w:tcPr>
-            <w:tcW w:w="2248" w:type="dxa"/>
+            <w:tcW w:w="1927" w:type="dxa"/>
             <w:tcBorders>
               <w:top w:val="single" w:sz="8" w:space="0" w:color="000000"/>
               <w:left w:val="single" w:sz="8" w:space="0" w:color="000000"/>
@@ -9271,18 +9458,18 @@
         </w:tc>
         <w:tc>
           <w:tcPr>
-            <w:tcW w:w="3913" w:type="dxa"/>
-            <w:tcBorders>
-              <w:top w:val="single" w:sz="8" w:space="0" w:color="000000"/>
-              <w:left w:val="single" w:sz="8" w:space="0" w:color="000000"/>
-              <w:bottom w:val="single" w:sz="8" w:space="0" w:color="000000"/>
-              <w:right w:val="single" w:sz="8" w:space="0" w:color="000000"/>
-            </w:tcBorders>
-            <w:vAlign w:val="center"/>
-          </w:tcPr>
-          <w:p>
-            <w:pPr>
-              <w:jc w:val="both"/>
+            <w:tcW w:w="2835" w:type="dxa"/>
+            <w:tcBorders>
+              <w:top w:val="single" w:sz="8" w:space="0" w:color="000000"/>
+              <w:left w:val="single" w:sz="8" w:space="0" w:color="000000"/>
+              <w:bottom w:val="single" w:sz="8" w:space="0" w:color="000000"/>
+              <w:right w:val="single" w:sz="8" w:space="0" w:color="000000"/>
+            </w:tcBorders>
+            <w:vAlign w:val="center"/>
+          </w:tcPr>
+          <w:p>
+            <w:pPr>
+              <w:jc w:val="left"/>
               <w:rPr>
                 <w:sz w:val="24"/>
                 <w:szCs w:val="24"/>
@@ -9301,11 +9488,12 @@
       </w:tr>
       <w:tr>
         <w:trPr>
+          <w:cantSplit/>
           <w:jc w:val="center"/>
         </w:trPr>
         <w:tc>
           <w:tcPr>
-            <w:tcW w:w="3367" w:type="dxa"/>
+            <w:tcW w:w="4309" w:type="dxa"/>
             <w:tcBorders>
               <w:top w:val="single" w:sz="8" w:space="0" w:color="000000"/>
               <w:left w:val="single" w:sz="8" w:space="0" w:color="000000"/>
@@ -9333,7 +9521,7 @@
         </w:tc>
         <w:tc>
           <w:tcPr>
-            <w:tcW w:w="2248" w:type="dxa"/>
+            <w:tcW w:w="1927" w:type="dxa"/>
             <w:tcBorders>
               <w:top w:val="single" w:sz="8" w:space="0" w:color="000000"/>
               <w:left w:val="single" w:sz="8" w:space="0" w:color="000000"/>
@@ -9361,18 +9549,18 @@
         </w:tc>
         <w:tc>
           <w:tcPr>
-            <w:tcW w:w="3913" w:type="dxa"/>
-            <w:tcBorders>
-              <w:top w:val="single" w:sz="8" w:space="0" w:color="000000"/>
-              <w:left w:val="single" w:sz="8" w:space="0" w:color="000000"/>
-              <w:bottom w:val="single" w:sz="8" w:space="0" w:color="000000"/>
-              <w:right w:val="single" w:sz="8" w:space="0" w:color="000000"/>
-            </w:tcBorders>
-            <w:vAlign w:val="center"/>
-          </w:tcPr>
-          <w:p>
-            <w:pPr>
-              <w:jc w:val="both"/>
+            <w:tcW w:w="2835" w:type="dxa"/>
+            <w:tcBorders>
+              <w:top w:val="single" w:sz="8" w:space="0" w:color="000000"/>
+              <w:left w:val="single" w:sz="8" w:space="0" w:color="000000"/>
+              <w:bottom w:val="single" w:sz="8" w:space="0" w:color="000000"/>
+              <w:right w:val="single" w:sz="8" w:space="0" w:color="000000"/>
+            </w:tcBorders>
+            <w:vAlign w:val="center"/>
+          </w:tcPr>
+          <w:p>
+            <w:pPr>
+              <w:jc w:val="left"/>
               <w:rPr>
                 <w:sz w:val="24"/>
                 <w:szCs w:val="24"/>
@@ -9391,11 +9579,12 @@
       </w:tr>
       <w:tr>
         <w:trPr>
+          <w:cantSplit/>
           <w:jc w:val="center"/>
         </w:trPr>
         <w:tc>
           <w:tcPr>
-            <w:tcW w:w="3367" w:type="dxa"/>
+            <w:tcW w:w="4309" w:type="dxa"/>
             <w:tcBorders>
               <w:top w:val="single" w:sz="8" w:space="0" w:color="000000"/>
               <w:left w:val="single" w:sz="8" w:space="0" w:color="000000"/>
@@ -9423,7 +9612,7 @@
         </w:tc>
         <w:tc>
           <w:tcPr>
-            <w:tcW w:w="2248" w:type="dxa"/>
+            <w:tcW w:w="1927" w:type="dxa"/>
             <w:tcBorders>
               <w:top w:val="single" w:sz="8" w:space="0" w:color="000000"/>
               <w:left w:val="single" w:sz="8" w:space="0" w:color="000000"/>
@@ -9451,18 +9640,18 @@
         </w:tc>
         <w:tc>
           <w:tcPr>
-            <w:tcW w:w="3913" w:type="dxa"/>
-            <w:tcBorders>
-              <w:top w:val="single" w:sz="8" w:space="0" w:color="000000"/>
-              <w:left w:val="single" w:sz="8" w:space="0" w:color="000000"/>
-              <w:bottom w:val="single" w:sz="8" w:space="0" w:color="000000"/>
-              <w:right w:val="single" w:sz="8" w:space="0" w:color="000000"/>
-            </w:tcBorders>
-            <w:vAlign w:val="center"/>
-          </w:tcPr>
-          <w:p>
-            <w:pPr>
-              <w:jc w:val="both"/>
+            <w:tcW w:w="2835" w:type="dxa"/>
+            <w:tcBorders>
+              <w:top w:val="single" w:sz="8" w:space="0" w:color="000000"/>
+              <w:left w:val="single" w:sz="8" w:space="0" w:color="000000"/>
+              <w:bottom w:val="single" w:sz="8" w:space="0" w:color="000000"/>
+              <w:right w:val="single" w:sz="8" w:space="0" w:color="000000"/>
+            </w:tcBorders>
+            <w:vAlign w:val="center"/>
+          </w:tcPr>
+          <w:p>
+            <w:pPr>
+              <w:jc w:val="left"/>
               <w:rPr>
                 <w:sz w:val="24"/>
                 <w:szCs w:val="24"/>
@@ -9600,7 +9789,7 @@
           <w:sz w:val="24"/>
           <w:szCs w:val="24"/>
         </w:rPr>
-        <w:t xml:space="preserve">Gambar 1. Alur penawaran dari penyusunan proposal sampai pengiriman ke customer. Permintaan pengecualian komersial sesudah pengiriman memakai butir 6.4 dan 6.5.</w:t>
+        <w:t xml:space="preserve">Gambar 1. Alur penawaran dari penyusunan proposal sampai pengiriman ke customer. Permintaan pengecualian komersial setelah pengiriman memakai butir 6.4 dan 6.5.</w:t>
       </w:r>
     </w:p>
     <w:p>
@@ -9635,6 +9824,7 @@
     <w:p>
       <w:pPr>
         <w:pStyle w:val="Heading1"/>
+        <w:keepNext/>
         <w:numPr>
           <w:ilvl w:val="0"/>
           <w:numId w:val="7"/>
@@ -9663,6 +9853,8 @@
       </w:tblGrid>
       <w:tr>
         <w:trPr>
+          <w:cantSplit/>
+          <w:tblHeader/>
           <w:jc w:val="center"/>
         </w:trPr>
         <w:tc>
@@ -9678,6 +9870,7 @@
           </w:tcPr>
           <w:p>
             <w:pPr>
+              <w:keepNext/>
               <w:jc w:val="center"/>
               <w:rPr>
                 <w:sz w:val="24"/>
@@ -9708,6 +9901,7 @@
           </w:tcPr>
           <w:p>
             <w:pPr>
+              <w:keepNext/>
               <w:jc w:val="center"/>
               <w:rPr>
                 <w:sz w:val="24"/>
@@ -9738,6 +9932,7 @@
           </w:tcPr>
           <w:p>
             <w:pPr>
+              <w:keepNext/>
               <w:jc w:val="center"/>
               <w:rPr>
                 <w:sz w:val="24"/>
@@ -9758,6 +9953,7 @@
       </w:tr>
       <w:tr>
         <w:trPr>
+          <w:cantSplit/>
           <w:jc w:val="center"/>
         </w:trPr>
         <w:tc>
@@ -9829,7 +10025,7 @@
           </w:tcPr>
           <w:p>
             <w:pPr>
-              <w:jc w:val="both"/>
+              <w:jc w:val="left"/>
               <w:rPr>
                 <w:sz w:val="24"/>
                 <w:szCs w:val="24"/>
@@ -9848,6 +10044,7 @@
       </w:tr>
       <w:tr>
         <w:trPr>
+          <w:cantSplit/>
           <w:jc w:val="center"/>
         </w:trPr>
         <w:tc>
@@ -9919,7 +10116,7 @@
           </w:tcPr>
           <w:p>
             <w:pPr>
-              <w:jc w:val="both"/>
+              <w:jc w:val="left"/>
               <w:rPr>
                 <w:sz w:val="24"/>
                 <w:szCs w:val="24"/>
@@ -9938,6 +10135,7 @@
       </w:tr>
       <w:tr>
         <w:trPr>
+          <w:cantSplit/>
           <w:jc w:val="center"/>
         </w:trPr>
         <w:tc>
@@ -10009,7 +10207,7 @@
           </w:tcPr>
           <w:p>
             <w:pPr>
-              <w:jc w:val="both"/>
+              <w:jc w:val="left"/>
               <w:rPr>
                 <w:sz w:val="24"/>
                 <w:szCs w:val="24"/>
@@ -10028,6 +10226,7 @@
       </w:tr>
       <w:tr>
         <w:trPr>
+          <w:cantSplit/>
           <w:jc w:val="center"/>
         </w:trPr>
         <w:tc>
@@ -10099,7 +10298,7 @@
           </w:tcPr>
           <w:p>
             <w:pPr>
-              <w:jc w:val="both"/>
+              <w:jc w:val="left"/>
               <w:rPr>
                 <w:sz w:val="24"/>
                 <w:szCs w:val="24"/>
@@ -10118,6 +10317,7 @@
       </w:tr>
       <w:tr>
         <w:trPr>
+          <w:cantSplit/>
           <w:jc w:val="center"/>
         </w:trPr>
         <w:tc>
@@ -10189,7 +10389,7 @@
           </w:tcPr>
           <w:p>
             <w:pPr>
-              <w:jc w:val="both"/>
+              <w:jc w:val="left"/>
               <w:rPr>
                 <w:sz w:val="24"/>
                 <w:szCs w:val="24"/>
@@ -10208,6 +10408,7 @@
       </w:tr>
       <w:tr>
         <w:trPr>
+          <w:cantSplit/>
           <w:jc w:val="center"/>
         </w:trPr>
         <w:tc>
@@ -10279,7 +10480,7 @@
           </w:tcPr>
           <w:p>
             <w:pPr>
-              <w:jc w:val="both"/>
+              <w:jc w:val="left"/>
               <w:rPr>
                 <w:sz w:val="24"/>
                 <w:szCs w:val="24"/>
@@ -10298,6 +10499,7 @@
       </w:tr>
       <w:tr>
         <w:trPr>
+          <w:cantSplit/>
           <w:jc w:val="center"/>
         </w:trPr>
         <w:tc>
@@ -10369,7 +10571,7 @@
           </w:tcPr>
           <w:p>
             <w:pPr>
-              <w:jc w:val="both"/>
+              <w:jc w:val="left"/>
               <w:rPr>
                 <w:sz w:val="24"/>
                 <w:szCs w:val="24"/>
@@ -10388,6 +10590,7 @@
       </w:tr>
       <w:tr>
         <w:trPr>
+          <w:cantSplit/>
           <w:jc w:val="center"/>
         </w:trPr>
         <w:tc>
@@ -10459,7 +10662,7 @@
           </w:tcPr>
           <w:p>
             <w:pPr>
-              <w:jc w:val="both"/>
+              <w:jc w:val="left"/>
               <w:rPr>
                 <w:sz w:val="24"/>
                 <w:szCs w:val="24"/>
@@ -10478,6 +10681,7 @@
       </w:tr>
       <w:tr>
         <w:trPr>
+          <w:cantSplit/>
           <w:jc w:val="center"/>
         </w:trPr>
         <w:tc>
@@ -10549,7 +10753,7 @@
           </w:tcPr>
           <w:p>
             <w:pPr>
-              <w:jc w:val="both"/>
+              <w:jc w:val="left"/>
               <w:rPr>
                 <w:sz w:val="24"/>
                 <w:szCs w:val="24"/>
@@ -10578,6 +10782,7 @@
     <w:p>
       <w:pPr>
         <w:pStyle w:val="Heading1"/>
+        <w:keepNext/>
         <w:numPr>
           <w:ilvl w:val="0"/>
           <w:numId w:val="7"/>
@@ -10610,6 +10815,10 @@
         <w:gridCol w:w="6765"/>
       </w:tblGrid>
       <w:tr>
+        <w:trPr>
+          <w:cantSplit/>
+          <w:tblHeader/>
+        </w:trPr>
         <w:tc>
           <w:tcPr>
             <w:tcW w:w="2745" w:type="dxa"/>
@@ -10622,6 +10831,7 @@
           </w:tcPr>
           <w:p>
             <w:pPr>
+              <w:keepNext/>
               <w:spacing w:after="120" w:line="252" w:lineRule="auto"/>
               <w:rPr>
                 <w:sz w:val="24"/>
@@ -10650,8 +10860,9 @@
           </w:tcPr>
           <w:p>
             <w:pPr>
+              <w:keepNext/>
               <w:spacing w:after="120" w:line="252" w:lineRule="auto"/>
-              <w:jc w:val="both"/>
+              <w:jc w:val="left"/>
               <w:rPr>
                 <w:sz w:val="24"/>
                 <w:szCs w:val="24"/>
@@ -10669,6 +10880,9 @@
         </w:tc>
       </w:tr>
       <w:tr>
+        <w:trPr>
+          <w:cantSplit/>
+        </w:trPr>
         <w:tc>
           <w:tcPr>
             <w:tcW w:w="2745" w:type="dxa"/>
@@ -10710,7 +10924,7 @@
           <w:p>
             <w:pPr>
               <w:spacing w:after="120" w:line="252" w:lineRule="auto"/>
-              <w:jc w:val="both"/>
+              <w:jc w:val="left"/>
               <w:rPr>
                 <w:sz w:val="24"/>
                 <w:szCs w:val="24"/>
@@ -10728,6 +10942,9 @@
         </w:tc>
       </w:tr>
       <w:tr>
+        <w:trPr>
+          <w:cantSplit/>
+        </w:trPr>
         <w:tc>
           <w:tcPr>
             <w:tcW w:w="2745" w:type="dxa"/>
@@ -10769,7 +10986,7 @@
           <w:p>
             <w:pPr>
               <w:spacing w:after="120" w:line="252" w:lineRule="auto"/>
-              <w:jc w:val="both"/>
+              <w:jc w:val="left"/>
               <w:rPr>
                 <w:sz w:val="24"/>
                 <w:szCs w:val="24"/>
@@ -10787,6 +11004,9 @@
         </w:tc>
       </w:tr>
       <w:tr>
+        <w:trPr>
+          <w:cantSplit/>
+        </w:trPr>
         <w:tc>
           <w:tcPr>
             <w:tcW w:w="2745" w:type="dxa"/>
@@ -10828,7 +11048,7 @@
           <w:p>
             <w:pPr>
               <w:spacing w:after="120" w:line="252" w:lineRule="auto"/>
-              <w:jc w:val="both"/>
+              <w:jc w:val="left"/>
               <w:rPr>
                 <w:sz w:val="24"/>
                 <w:szCs w:val="24"/>
@@ -10846,6 +11066,9 @@
         </w:tc>
       </w:tr>
       <w:tr>
+        <w:trPr>
+          <w:cantSplit/>
+        </w:trPr>
         <w:tc>
           <w:tcPr>
             <w:tcW w:w="2745" w:type="dxa"/>
@@ -10887,7 +11110,7 @@
           <w:p>
             <w:pPr>
               <w:spacing w:after="120" w:line="252" w:lineRule="auto"/>
-              <w:jc w:val="both"/>
+              <w:jc w:val="left"/>
               <w:rPr>
                 <w:sz w:val="24"/>
                 <w:szCs w:val="24"/>
@@ -10905,6 +11128,9 @@
         </w:tc>
       </w:tr>
       <w:tr>
+        <w:trPr>
+          <w:cantSplit/>
+        </w:trPr>
         <w:tc>
           <w:tcPr>
             <w:tcW w:w="2745" w:type="dxa"/>
@@ -10946,7 +11172,7 @@
           <w:p>
             <w:pPr>
               <w:spacing w:after="120" w:line="252" w:lineRule="auto"/>
-              <w:jc w:val="both"/>
+              <w:jc w:val="left"/>
               <w:rPr>
                 <w:sz w:val="24"/>
                 <w:szCs w:val="24"/>
@@ -10964,6 +11190,9 @@
         </w:tc>
       </w:tr>
       <w:tr>
+        <w:trPr>
+          <w:cantSplit/>
+        </w:trPr>
         <w:tc>
           <w:tcPr>
             <w:tcW w:w="2745" w:type="dxa"/>
@@ -11005,7 +11234,7 @@
           <w:p>
             <w:pPr>
               <w:spacing w:after="120" w:line="252" w:lineRule="auto"/>
-              <w:jc w:val="both"/>
+              <w:jc w:val="left"/>
               <w:rPr>
                 <w:sz w:val="24"/>
                 <w:szCs w:val="24"/>
@@ -11023,6 +11252,9 @@
         </w:tc>
       </w:tr>
       <w:tr>
+        <w:trPr>
+          <w:cantSplit/>
+        </w:trPr>
         <w:tc>
           <w:tcPr>
             <w:tcW w:w="2745" w:type="dxa"/>
@@ -11064,7 +11296,7 @@
           <w:p>
             <w:pPr>
               <w:spacing w:after="120" w:line="252" w:lineRule="auto"/>
-              <w:jc w:val="both"/>
+              <w:jc w:val="left"/>
               <w:rPr>
                 <w:sz w:val="24"/>
                 <w:szCs w:val="24"/>
@@ -11082,6 +11314,9 @@
         </w:tc>
       </w:tr>
       <w:tr>
+        <w:trPr>
+          <w:cantSplit/>
+        </w:trPr>
         <w:tc>
           <w:tcPr>
             <w:tcW w:w="2745" w:type="dxa"/>
@@ -11106,7 +11341,7 @@
                 <w:sz w:val="24"/>
                 <w:szCs w:val="24"/>
               </w:rPr>
-              <w:t>COO atau Direktur Utama tidak dapat memberi persetujuan sebelum customer membutuhkan penawaran</w:t>
+              <w:t>Persetujuan COO atau Direktur Utama belum ada saat penawaran dibutuhkan customer</w:t>
             </w:r>
           </w:p>
         </w:tc>
@@ -11123,7 +11358,7 @@
           <w:p>
             <w:pPr>
               <w:spacing w:after="120" w:line="252" w:lineRule="auto"/>
-              <w:jc w:val="both"/>
+              <w:jc w:val="left"/>
               <w:rPr>
                 <w:sz w:val="24"/>
                 <w:szCs w:val="24"/>
@@ -11141,6 +11376,9 @@
         </w:tc>
       </w:tr>
       <w:tr>
+        <w:trPr>
+          <w:cantSplit/>
+        </w:trPr>
         <w:tc>
           <w:tcPr>
             <w:tcW w:w="2745" w:type="dxa"/>
@@ -11182,19 +11420,19 @@
           <w:p>
             <w:pPr>
               <w:spacing w:after="120" w:line="252" w:lineRule="auto"/>
-              <w:jc w:val="both"/>
-              <w:rPr>
-                <w:sz w:val="24"/>
-                <w:szCs w:val="24"/>
-              </w:rPr>
-            </w:pPr>
-            <w:r>
-              <w:rPr>
-                <w:b w:val="0"/>
-                <w:sz w:val="24"/>
-                <w:szCs w:val="24"/>
-              </w:rPr>
-              <w:t>Business Development atau VP Commercial yang perlu menyimpang memperoleh persetujuan VP Commercial atau pihak yang berwenang atas penyimpangan tersebut.</w:t>
+              <w:jc w:val="left"/>
+              <w:rPr>
+                <w:sz w:val="24"/>
+                <w:szCs w:val="24"/>
+              </w:rPr>
+            </w:pPr>
+            <w:r>
+              <w:rPr>
+                <w:b w:val="0"/>
+                <w:sz w:val="24"/>
+                <w:szCs w:val="24"/>
+              </w:rPr>
+              <w:t>Personel itu memperoleh persetujuan VP Commercial atau pihak yang berwenang atas penyimpangan tersebut.</w:t>
             </w:r>
           </w:p>
         </w:tc>
@@ -11277,7 +11515,7 @@
           <w:sz w:val="24"/>
           <w:szCs w:val="24"/>
         </w:rPr>
-        <w:t xml:space="preserve">VP Commercial, pemilik SOP ini, meninjau SOP ini setiap tahun, dan lebih awal bila ambang diskon, batas margin minimum, atau Authority Matrix ditetapkan.</w:t>
+        <w:t xml:space="preserve">VP Commercial selaku pemilik SOP meninjau SOP ini setiap tahun, atau lebih awal jika ambang diskon, batas margin minimum, atau Authority Matrix ditetapkan.</w:t>
       </w:r>
     </w:p>
     <w:p>
@@ -11329,6 +11567,7 @@
     </w:p>
     <w:p>
       <w:pPr>
+        <w:keepNext/>
         <w:pBdr>
           <w:top w:val="nil"/>
           <w:left w:val="nil"/>
@@ -11375,6 +11614,8 @@
       </w:tblGrid>
       <w:tr>
         <w:trPr>
+          <w:cantSplit/>
+          <w:tblHeader/>
           <w:jc w:val="center"/>
         </w:trPr>
         <w:tc>
@@ -11384,6 +11625,7 @@
           </w:tcPr>
           <w:p>
             <w:pPr>
+              <w:keepNext/>
               <w:jc w:val="center"/>
               <w:rPr>
                 <w:sz w:val="24"/>
@@ -11408,6 +11650,7 @@
           </w:tcPr>
           <w:p>
             <w:pPr>
+              <w:keepNext/>
               <w:jc w:val="center"/>
               <w:rPr>
                 <w:sz w:val="24"/>
@@ -11428,6 +11671,7 @@
       </w:tr>
       <w:tr>
         <w:trPr>
+          <w:cantSplit/>
           <w:jc w:val="center"/>
         </w:trPr>
         <w:tc>
@@ -11470,13 +11714,14 @@
                 <w:sz w:val="24"/>
                 <w:szCs w:val="24"/>
               </w:rPr>
-              <w:t>Sales Process; memuat butir 4.6 (qualification), butir 4.13 (klasifikasi dan berbagi informasi RESTRICTED), dan butir 6.3 (discovery meeting). Butir 4.8 sampai 4.11 dan 6.4 dokumen itu meringkas proposal, quotation, dan harga; rinciannya ada di SOP ini (USULAN).</w:t>
+              <w:t>Sales Process; memuat butir 4.6 (qualification), butir 4.13 (klasifikasi dan berbagi informasi RESTRICTED), dan butir 6.3 (discovery meeting). Butir 4.8 sampai 4.11 dan 6.4 dokumen itu meringkas proposal, quotation, dan harga; rinciannya diatur di SOP ini (USULAN).</w:t>
             </w:r>
           </w:p>
         </w:tc>
       </w:tr>
       <w:tr>
         <w:trPr>
+          <w:cantSplit/>
           <w:jc w:val="center"/>
         </w:trPr>
         <w:tc>
@@ -11526,6 +11771,7 @@
       </w:tr>
       <w:tr>
         <w:trPr>
+          <w:cantSplit/>
           <w:jc w:val="center"/>
         </w:trPr>
         <w:tc>
@@ -11575,6 +11821,7 @@
       </w:tr>
       <w:tr>
         <w:trPr>
+          <w:cantSplit/>
           <w:jc w:val="center"/>
         </w:trPr>
         <w:tc>
@@ -11624,6 +11871,7 @@
       </w:tr>
       <w:tr>
         <w:trPr>
+          <w:cantSplit/>
           <w:jc w:val="center"/>
         </w:trPr>
         <w:tc>
@@ -11673,6 +11921,7 @@
       </w:tr>
       <w:tr>
         <w:trPr>
+          <w:cantSplit/>
           <w:jc w:val="center"/>
         </w:trPr>
         <w:tc>
@@ -11722,6 +11971,7 @@
       </w:tr>
       <w:tr>
         <w:trPr>
+          <w:cantSplit/>
           <w:jc w:val="center"/>
         </w:trPr>
         <w:tc>
@@ -11764,13 +12014,14 @@
                 <w:sz w:val="24"/>
                 <w:szCs w:val="24"/>
               </w:rPr>
-              <w:t>Customer Requirement &amp; Order Review Record; bentuk rekaman Catatan review scope (USULAN).</w:t>
+              <w:t>Customer Requirement &amp; Order Review Record; bentuk record Catatan review scope (USULAN).</w:t>
             </w:r>
           </w:p>
         </w:tc>
       </w:tr>
       <w:tr>
         <w:trPr>
+          <w:cantSplit/>
           <w:jc w:val="center"/>
         </w:trPr>
         <w:tc>
@@ -11821,6 +12072,7 @@
     </w:tbl>
     <w:p>
       <w:pPr>
+        <w:keepNext/>
         <w:pBdr>
           <w:top w:val="nil"/>
           <w:left w:val="nil"/>
@@ -11860,6 +12112,8 @@
       </w:tblGrid>
       <w:tr>
         <w:trPr>
+          <w:cantSplit/>
+          <w:tblHeader/>
           <w:jc w:val="center"/>
         </w:trPr>
         <w:tc>
@@ -11875,6 +12129,7 @@
           </w:tcPr>
           <w:p>
             <w:pPr>
+              <w:keepNext/>
               <w:jc w:val="center"/>
               <w:rPr>
                 <w:sz w:val="24"/>
@@ -11905,6 +12160,7 @@
           </w:tcPr>
           <w:p>
             <w:pPr>
+              <w:keepNext/>
               <w:jc w:val="center"/>
               <w:rPr>
                 <w:sz w:val="24"/>
@@ -11935,6 +12191,7 @@
           </w:tcPr>
           <w:p>
             <w:pPr>
+              <w:keepNext/>
               <w:jc w:val="center"/>
               <w:rPr>
                 <w:sz w:val="24"/>
@@ -11955,6 +12212,7 @@
       </w:tr>
       <w:tr>
         <w:trPr>
+          <w:cantSplit/>
           <w:jc w:val="center"/>
         </w:trPr>
         <w:tc>
@@ -12026,7 +12284,7 @@
           </w:tcPr>
           <w:p>
             <w:pPr>
-              <w:jc w:val="both"/>
+              <w:jc w:val="left"/>
               <w:rPr>
                 <w:sz w:val="24"/>
                 <w:szCs w:val="24"/>
@@ -12045,6 +12303,7 @@
       </w:tr>
       <w:tr>
         <w:trPr>
+          <w:cantSplit/>
           <w:jc w:val="center"/>
         </w:trPr>
         <w:tc>
@@ -12099,7 +12358,7 @@
                 <w:sz w:val="24"/>
                 <w:szCs w:val="24"/>
               </w:rPr>
-              <w:t>Rekaman baru (USULAN). Lokasi belum ditetapkan; dikelola Business Development; bentuk rekamannya SNX-COM-FRM-01 (USULAN)</w:t>
+              <w:t>Record baru (USULAN). Lokasi belum ditetapkan; dikelola Business Development; bentuk record-nya SNX-COM-FRM-01 (USULAN)</w:t>
             </w:r>
           </w:p>
         </w:tc>
@@ -12116,7 +12375,7 @@
           </w:tcPr>
           <w:p>
             <w:pPr>
-              <w:jc w:val="both"/>
+              <w:jc w:val="left"/>
               <w:rPr>
                 <w:sz w:val="24"/>
                 <w:szCs w:val="24"/>
@@ -12135,6 +12394,7 @@
       </w:tr>
       <w:tr>
         <w:trPr>
+          <w:cantSplit/>
           <w:jc w:val="center"/>
         </w:trPr>
         <w:tc>
@@ -12189,7 +12449,7 @@
                 <w:sz w:val="24"/>
                 <w:szCs w:val="24"/>
               </w:rPr>
-              <w:t>Rekaman baru (USULAN). Lokasi belum ditetapkan; dikelola Business Development; berklasifikasi RESTRICTED (Internal) (butir 4.13)</w:t>
+              <w:t>Record baru (USULAN). Lokasi belum ditetapkan; dikelola Business Development; berklasifikasi RESTRICTED (Internal) (butir 4.13)</w:t>
             </w:r>
           </w:p>
         </w:tc>
@@ -12206,7 +12466,7 @@
           </w:tcPr>
           <w:p>
             <w:pPr>
-              <w:jc w:val="both"/>
+              <w:jc w:val="left"/>
               <w:rPr>
                 <w:sz w:val="24"/>
                 <w:szCs w:val="24"/>
@@ -12225,6 +12485,7 @@
       </w:tr>
       <w:tr>
         <w:trPr>
+          <w:cantSplit/>
           <w:jc w:val="center"/>
         </w:trPr>
         <w:tc>
@@ -12279,7 +12540,7 @@
                 <w:sz w:val="24"/>
                 <w:szCs w:val="24"/>
               </w:rPr>
-              <w:t>Rekaman baru (USULAN). Lokasi belum ditetapkan; pemilik VP Commercial</w:t>
+              <w:t>Record baru (USULAN). Lokasi belum ditetapkan; pemilik VP Commercial</w:t>
             </w:r>
           </w:p>
         </w:tc>
@@ -12296,7 +12557,7 @@
           </w:tcPr>
           <w:p>
             <w:pPr>
-              <w:jc w:val="both"/>
+              <w:jc w:val="left"/>
               <w:rPr>
                 <w:sz w:val="24"/>
                 <w:szCs w:val="24"/>
@@ -12315,6 +12576,7 @@
       </w:tr>
       <w:tr>
         <w:trPr>
+          <w:cantSplit/>
           <w:jc w:val="center"/>
         </w:trPr>
         <w:tc>
@@ -12386,7 +12648,7 @@
           </w:tcPr>
           <w:p>
             <w:pPr>
-              <w:jc w:val="both"/>
+              <w:jc w:val="left"/>
               <w:rPr>
                 <w:sz w:val="24"/>
                 <w:szCs w:val="24"/>
@@ -12405,6 +12667,7 @@
       </w:tr>
       <w:tr>
         <w:trPr>
+          <w:cantSplit/>
           <w:jc w:val="center"/>
         </w:trPr>
         <w:tc>
@@ -12476,7 +12739,7 @@
           </w:tcPr>
           <w:p>
             <w:pPr>
-              <w:jc w:val="both"/>
+              <w:jc w:val="left"/>
               <w:rPr>
                 <w:sz w:val="24"/>
                 <w:szCs w:val="24"/>
@@ -12564,7 +12827,7 @@
           <w:sz w:val="24"/>
           <w:szCs w:val="24"/>
         </w:rPr>
-        <w:t xml:space="preserve">ISO 9001:2015: 5.3 (Peran, tanggung jawab, dan wewenang di organisasi), untuk tabel peran dan wewenang harga di butir 4.7; 7.5.3 (Pengendalian informasi terdokumentasi), untuk rekaman di bagian 11 dan pencatatan di CRM di butir 4.14; 8.2.1 (Komunikasi dengan pelanggan), untuk isi proposal dan quotation yang diterima customer di butir 4.2; 8.2.2 (Penentuan persyaratan untuk produk dan jasa), untuk kesesuaian scope dengan Business Requirement di butir 6.2; 8.2.3 (Tinjauan persyaratan untuk produk dan jasa), untuk review scope, validasi harga dan margin, review internal, dan persetujuan sebelum penawaran dikirim di butir 6.2, 6.3, dan 6.5; 8.2.4 (Perubahan persyaratan untuk produk dan jasa), untuk perubahan harga, diskon, scope, atau timeline sesudah persetujuan sebagai pengecualian komersial di butir 6.4.</w:t>
+        <w:t xml:space="preserve">ISO 9001:2015: 5.3 (Peran, tanggung jawab, dan wewenang di organisasi), untuk tabel peran dan wewenang harga di butir 4.7; 7.5.3 (Pengendalian informasi terdokumentasi), untuk rekaman di bagian 11 dan pencatatan di CRM di butir 4.14; 8.2.1 (Komunikasi dengan pelanggan), untuk isi proposal dan quotation yang diterima customer di butir 4.2; 8.2.2 (Penentuan persyaratan untuk produk dan jasa), untuk kesesuaian scope dengan Business Requirement di butir 6.2; 8.2.3 (Tinjauan persyaratan untuk produk dan jasa), untuk review scope, validasi harga dan margin, review internal, dan persetujuan sebelum penawaran dikirim di butir 6.2, 6.3, dan 6.5; 8.2.4 (Perubahan persyaratan untuk produk dan jasa), untuk perubahan harga, diskon, scope, atau timeline setelah persetujuan sebagai pengecualian komersial di butir 6.4.</w:t>
       </w:r>
     </w:p>
     <w:p>

</xml_diff>